<commit_message>
Update correct results for wlnm_original with sweep train ratio #32
</commit_message>
<xml_diff>
--- a/docs/Methodology documentation/Supplementary Documents/Supplementary Information - Description Document.docx
+++ b/docs/Methodology documentation/Supplementary Documents/Supplementary Information - Description Document.docx
@@ -94,21 +94,12 @@
       </w:r>
     </w:p>
     <w:p>
-      <w:pPr>
-        <w:rPr>
-          <w:noProof/>
-          <w14:ligatures w14:val="standardContextual"/>
-        </w:rPr>
-      </w:pPr>
-      <w:r>
-        <w:rPr>
-          <w:noProof/>
-        </w:rPr>
+      <w:r>
         <w:drawing>
-          <wp:inline distT="0" distB="0" distL="0" distR="0" wp14:anchorId="4D712365" wp14:editId="4F139FAF">
-            <wp:extent cx="2704534" cy="1554480"/>
-            <wp:effectExtent l="0" t="0" r="635" b="0"/>
-            <wp:docPr id="668025242" name="Picture 1" descr="A graph with red and blue lines&#10;&#10;AI-generated content may be incorrect."/>
+          <wp:inline distT="0" distB="0" distL="0" distR="0" wp14:anchorId="3826AAA6" wp14:editId="52233D73">
+            <wp:extent cx="4100195" cy="2192512"/>
+            <wp:effectExtent l="0" t="0" r="1905" b="5080"/>
+            <wp:docPr id="1900219112" name="Picture 1"/>
             <wp:cNvGraphicFramePr>
               <a:graphicFrameLocks xmlns:a="http://schemas.openxmlformats.org/drawingml/2006/main" noChangeAspect="1"/>
             </wp:cNvGraphicFramePr>
@@ -116,23 +107,32 @@
               <a:graphicData uri="http://schemas.openxmlformats.org/drawingml/2006/picture">
                 <pic:pic xmlns:pic="http://schemas.openxmlformats.org/drawingml/2006/picture">
                   <pic:nvPicPr>
-                    <pic:cNvPr id="668025242" name="Picture 1" descr="A graph with red and blue lines&#10;&#10;AI-generated content may be incorrect."/>
+                    <pic:cNvPr id="1900219112" name=""/>
                     <pic:cNvPicPr/>
                   </pic:nvPicPr>
-                  <pic:blipFill>
+                  <pic:blipFill rotWithShape="1">
                     <a:blip r:embed="rId7"/>
+                    <a:srcRect t="5635"/>
                     <a:stretch>
                       <a:fillRect/>
                     </a:stretch>
                   </pic:blipFill>
-                  <pic:spPr>
+                  <pic:spPr bwMode="auto">
                     <a:xfrm>
                       <a:off x="0" y="0"/>
-                      <a:ext cx="2704534" cy="1554480"/>
+                      <a:ext cx="4187595" cy="2239247"/>
                     </a:xfrm>
                     <a:prstGeom prst="rect">
                       <a:avLst/>
                     </a:prstGeom>
+                    <a:ln>
+                      <a:noFill/>
+                    </a:ln>
+                    <a:extLst>
+                      <a:ext uri="{53640926-AAD7-44D8-BBD7-CCE9431645EC}">
+                        <a14:shadowObscured xmlns:a14="http://schemas.microsoft.com/office/drawing/2010/main"/>
+                      </a:ext>
+                    </a:extLst>
                   </pic:spPr>
                 </pic:pic>
               </a:graphicData>
@@ -141,21 +141,11 @@
         </w:drawing>
       </w:r>
       <w:r>
-        <w:rPr>
-          <w:noProof/>
-          <w14:ligatures w14:val="standardContextual"/>
-        </w:rPr>
-        <w:t xml:space="preserve"> </w:t>
-      </w:r>
-      <w:r>
-        <w:rPr>
-          <w:noProof/>
-        </w:rPr>
         <w:drawing>
-          <wp:inline distT="0" distB="0" distL="0" distR="0" wp14:anchorId="15186480" wp14:editId="3EE1E46D">
-            <wp:extent cx="2704532" cy="1554480"/>
-            <wp:effectExtent l="0" t="0" r="635" b="0"/>
-            <wp:docPr id="1056932860" name="Picture 1" descr="A graph of a stream&#10;&#10;AI-generated content may be incorrect."/>
+          <wp:inline distT="0" distB="0" distL="0" distR="0" wp14:anchorId="2D40D5E4" wp14:editId="148F7E1A">
+            <wp:extent cx="4100300" cy="2182293"/>
+            <wp:effectExtent l="0" t="0" r="1905" b="2540"/>
+            <wp:docPr id="1033677189" name="Picture 1"/>
             <wp:cNvGraphicFramePr>
               <a:graphicFrameLocks xmlns:a="http://schemas.openxmlformats.org/drawingml/2006/main" noChangeAspect="1"/>
             </wp:cNvGraphicFramePr>
@@ -163,23 +153,32 @@
               <a:graphicData uri="http://schemas.openxmlformats.org/drawingml/2006/picture">
                 <pic:pic xmlns:pic="http://schemas.openxmlformats.org/drawingml/2006/picture">
                   <pic:nvPicPr>
-                    <pic:cNvPr id="1056932860" name="Picture 1" descr="A graph of a stream&#10;&#10;AI-generated content may be incorrect."/>
+                    <pic:cNvPr id="1033677189" name=""/>
                     <pic:cNvPicPr/>
                   </pic:nvPicPr>
-                  <pic:blipFill>
+                  <pic:blipFill rotWithShape="1">
                     <a:blip r:embed="rId8"/>
+                    <a:srcRect t="6077"/>
                     <a:stretch>
                       <a:fillRect/>
                     </a:stretch>
                   </pic:blipFill>
-                  <pic:spPr>
+                  <pic:spPr bwMode="auto">
                     <a:xfrm>
                       <a:off x="0" y="0"/>
-                      <a:ext cx="2704532" cy="1554480"/>
+                      <a:ext cx="4178936" cy="2224145"/>
                     </a:xfrm>
                     <a:prstGeom prst="rect">
                       <a:avLst/>
                     </a:prstGeom>
+                    <a:ln>
+                      <a:noFill/>
+                    </a:ln>
+                    <a:extLst>
+                      <a:ext uri="{53640926-AAD7-44D8-BBD7-CCE9431645EC}">
+                        <a14:shadowObscured xmlns:a14="http://schemas.microsoft.com/office/drawing/2010/main"/>
+                      </a:ext>
+                    </a:extLst>
                   </pic:spPr>
                 </pic:pic>
               </a:graphicData>
@@ -187,145 +186,15 @@
           </wp:inline>
         </w:drawing>
       </w:r>
-      <w:r>
+    </w:p>
+    <w:p>
+      <w:pPr>
+        <w:pStyle w:val="NormalWeb"/>
         <w:rPr>
-          <w:noProof/>
-          <w14:ligatures w14:val="standardContextual"/>
+          <w:i/>
+          <w:iCs/>
         </w:rPr>
-        <w:t xml:space="preserve"> </w:t>
-      </w:r>
-      <w:r>
-        <w:rPr>
-          <w:noProof/>
-          <w14:ligatures w14:val="standardContextual"/>
-        </w:rPr>
-        <w:drawing>
-          <wp:inline distT="0" distB="0" distL="0" distR="0" wp14:anchorId="0D04184B" wp14:editId="7B04F9FE">
-            <wp:extent cx="2704532" cy="1554480"/>
-            <wp:effectExtent l="0" t="0" r="635" b="0"/>
-            <wp:docPr id="58661164" name="Picture 1" descr="A graph of a train&#10;&#10;AI-generated content may be incorrect."/>
-            <wp:cNvGraphicFramePr>
-              <a:graphicFrameLocks xmlns:a="http://schemas.openxmlformats.org/drawingml/2006/main" noChangeAspect="1"/>
-            </wp:cNvGraphicFramePr>
-            <a:graphic xmlns:a="http://schemas.openxmlformats.org/drawingml/2006/main">
-              <a:graphicData uri="http://schemas.openxmlformats.org/drawingml/2006/picture">
-                <pic:pic xmlns:pic="http://schemas.openxmlformats.org/drawingml/2006/picture">
-                  <pic:nvPicPr>
-                    <pic:cNvPr id="58661164" name="Picture 1" descr="A graph of a train&#10;&#10;AI-generated content may be incorrect."/>
-                    <pic:cNvPicPr/>
-                  </pic:nvPicPr>
-                  <pic:blipFill>
-                    <a:blip r:embed="rId9"/>
-                    <a:stretch>
-                      <a:fillRect/>
-                    </a:stretch>
-                  </pic:blipFill>
-                  <pic:spPr>
-                    <a:xfrm>
-                      <a:off x="0" y="0"/>
-                      <a:ext cx="2704532" cy="1554480"/>
-                    </a:xfrm>
-                    <a:prstGeom prst="rect">
-                      <a:avLst/>
-                    </a:prstGeom>
-                  </pic:spPr>
-                </pic:pic>
-              </a:graphicData>
-            </a:graphic>
-          </wp:inline>
-        </w:drawing>
-      </w:r>
-    </w:p>
-    <w:p>
-      <w:r>
-        <w:rPr>
-          <w:noProof/>
-        </w:rPr>
-        <w:drawing>
-          <wp:inline distT="0" distB="0" distL="0" distR="0" wp14:anchorId="551A7466" wp14:editId="37A0CD72">
-            <wp:extent cx="2704532" cy="1554480"/>
-            <wp:effectExtent l="0" t="0" r="635" b="0"/>
-            <wp:docPr id="2086409603" name="Picture 1" descr="A graph with lines and numbers&#10;&#10;AI-generated content may be incorrect."/>
-            <wp:cNvGraphicFramePr>
-              <a:graphicFrameLocks xmlns:a="http://schemas.openxmlformats.org/drawingml/2006/main" noChangeAspect="1"/>
-            </wp:cNvGraphicFramePr>
-            <a:graphic xmlns:a="http://schemas.openxmlformats.org/drawingml/2006/main">
-              <a:graphicData uri="http://schemas.openxmlformats.org/drawingml/2006/picture">
-                <pic:pic xmlns:pic="http://schemas.openxmlformats.org/drawingml/2006/picture">
-                  <pic:nvPicPr>
-                    <pic:cNvPr id="2086409603" name="Picture 1" descr="A graph with lines and numbers&#10;&#10;AI-generated content may be incorrect."/>
-                    <pic:cNvPicPr/>
-                  </pic:nvPicPr>
-                  <pic:blipFill>
-                    <a:blip r:embed="rId10"/>
-                    <a:stretch>
-                      <a:fillRect/>
-                    </a:stretch>
-                  </pic:blipFill>
-                  <pic:spPr>
-                    <a:xfrm>
-                      <a:off x="0" y="0"/>
-                      <a:ext cx="2704532" cy="1554480"/>
-                    </a:xfrm>
-                    <a:prstGeom prst="rect">
-                      <a:avLst/>
-                    </a:prstGeom>
-                  </pic:spPr>
-                </pic:pic>
-              </a:graphicData>
-            </a:graphic>
-          </wp:inline>
-        </w:drawing>
-      </w:r>
-      <w:r>
-        <w:rPr>
-          <w:noProof/>
-          <w14:ligatures w14:val="standardContextual"/>
-        </w:rPr>
-        <w:t xml:space="preserve"> </w:t>
-      </w:r>
-      <w:r>
-        <w:rPr>
-          <w:noProof/>
-        </w:rPr>
-        <w:drawing>
-          <wp:inline distT="0" distB="0" distL="0" distR="0" wp14:anchorId="0D1058DF" wp14:editId="2EF64D21">
-            <wp:extent cx="2704532" cy="1554480"/>
-            <wp:effectExtent l="0" t="0" r="635" b="0"/>
-            <wp:docPr id="1513138970" name="Picture 1" descr="A graph with lines and numbers&#10;&#10;AI-generated content may be incorrect."/>
-            <wp:cNvGraphicFramePr>
-              <a:graphicFrameLocks xmlns:a="http://schemas.openxmlformats.org/drawingml/2006/main" noChangeAspect="1"/>
-            </wp:cNvGraphicFramePr>
-            <a:graphic xmlns:a="http://schemas.openxmlformats.org/drawingml/2006/main">
-              <a:graphicData uri="http://schemas.openxmlformats.org/drawingml/2006/picture">
-                <pic:pic xmlns:pic="http://schemas.openxmlformats.org/drawingml/2006/picture">
-                  <pic:nvPicPr>
-                    <pic:cNvPr id="1513138970" name="Picture 1" descr="A graph with lines and numbers&#10;&#10;AI-generated content may be incorrect."/>
-                    <pic:cNvPicPr/>
-                  </pic:nvPicPr>
-                  <pic:blipFill>
-                    <a:blip r:embed="rId11"/>
-                    <a:stretch>
-                      <a:fillRect/>
-                    </a:stretch>
-                  </pic:blipFill>
-                  <pic:spPr>
-                    <a:xfrm>
-                      <a:off x="0" y="0"/>
-                      <a:ext cx="2704532" cy="1554480"/>
-                    </a:xfrm>
-                    <a:prstGeom prst="rect">
-                      <a:avLst/>
-                    </a:prstGeom>
-                  </pic:spPr>
-                </pic:pic>
-              </a:graphicData>
-            </a:graphic>
-          </wp:inline>
-        </w:drawing>
-      </w:r>
-    </w:p>
-    <w:p>
+      </w:pPr>
       <w:r>
         <w:rPr>
           <w:rStyle w:val="Strong"/>
@@ -336,7 +205,35 @@
         <w:t xml:space="preserve"> </w:t>
       </w:r>
       <w:r>
-        <w:t>Each panel corresponds to one ecosystem type and plots four evaluation metrics—AUC (ranking ability), Precision (proportion of predicted links that are true), Recall (proportion of true links recovered) and F1 (harmonic mean of Precision and Recall)—against the training ratio expressed in percent (60–80). At each ratio we trained WLNM models and computed the metric for every food web in that ecosystem; the lines connect the mean score across food webs (and runs, when present), and points mark the five training fractions. Across ecosystems, curves are near-flat and close to the upper range of the scale, indicating that WLNM achieves consistently strong performance and that increasing the training fraction beyond 60% yields only modest improvements. Error bars are omitted here for compactness; a version with uncertainty bands is provided in the Supplementary Material.</w:t>
+        <w:t>Mean performance scores (AUC and Precision) are shown as a function of the proportion of observed links used for training, averaged across all food webs within each ecosystem category. Lines correspond to the mean trend for each ecosystem type, and shaded points indicate representative mid-range training configurations (30–40%) used in the main analyses.</w:t>
+      </w:r>
+      <w:r>
+        <w:t xml:space="preserve"> </w:t>
+      </w:r>
+      <w:r>
+        <w:t xml:space="preserve">Both panels reveal that predictive accuracy improves monotonically with training ratio, but the rate of improvement varies by ecosystem. Marine food webs display the slowest gain, requiring larger training fractions to exceed an AUC of 0.8, while lacustrine and terrestrial aboveground systems achieve near-optimal performance at substantially lower ratios (30–40%). Terrestrial belowground and stream ecosystems exhibit intermediate </w:t>
+      </w:r>
+      <w:proofErr w:type="spellStart"/>
+      <w:r>
+        <w:t>behaviour</w:t>
+      </w:r>
+      <w:proofErr w:type="spellEnd"/>
+      <w:r>
+        <w:t xml:space="preserve"> with gradual improvements beyond 60%.</w:t>
+      </w:r>
+      <w:r>
+        <w:t xml:space="preserve"> </w:t>
+      </w:r>
+      <w:r>
+        <w:t xml:space="preserve">Overall, the model demonstrates consistent convergence toward high discrimination (AUC &gt; 0.9) and precision (&gt;0.85) at training ratios above 70%, indicating that WLNM retains strong </w:t>
+      </w:r>
+      <w:proofErr w:type="spellStart"/>
+      <w:r>
+        <w:t>generalisation</w:t>
+      </w:r>
+      <w:proofErr w:type="spellEnd"/>
+      <w:r>
+        <w:t xml:space="preserve"> ability even under limited training data, with ecosystem-specific learning curves reflecting intrinsic structural variability among network types.</w:t>
       </w:r>
       <w:r>
         <w:br w:type="page"/>
@@ -364,7 +261,7 @@
                     <pic:cNvPicPr/>
                   </pic:nvPicPr>
                   <pic:blipFill>
-                    <a:blip r:embed="rId12"/>
+                    <a:blip r:embed="rId9"/>
                     <a:stretch>
                       <a:fillRect/>
                     </a:stretch>
@@ -401,7 +298,10 @@
       </w:r>
       <w:proofErr w:type="spellEnd"/>
       <w:r>
-        <w:t>–Lehman Neural Machine (WLNM) performs across five ecosystem types when trained with 80% of observed links. Each boxplot represents the distribution of four evaluation metrics</w:t>
+        <w:t>-</w:t>
+      </w:r>
+      <w:r>
+        <w:t>Lehman Neural Machine (WLNM) performs across five ecosystem types when trained with 80% of observed links. Each boxplot represents the distribution of four evaluation metrics</w:t>
       </w:r>
       <w:r>
         <w:t>,</w:t>
@@ -441,7 +341,7 @@
                     <pic:cNvPicPr/>
                   </pic:nvPicPr>
                   <pic:blipFill>
-                    <a:blip r:embed="rId13"/>
+                    <a:blip r:embed="rId10"/>
                     <a:stretch>
                       <a:fillRect/>
                     </a:stretch>
@@ -478,7 +378,10 @@
       </w:r>
       <w:proofErr w:type="spellEnd"/>
       <w:r>
-        <w:t>–Lehman Neural Machine (WLNM) across all 290 food webs using an 80/20 train/test split. Each boxplot displays the distribution of four evaluation metrics</w:t>
+        <w:t>-</w:t>
+      </w:r>
+      <w:r>
+        <w:t>Lehman Neural Machine (WLNM) across all 290 food webs using an 80/20 train/test split. Each boxplot displays the distribution of four evaluation metrics</w:t>
       </w:r>
       <w:r>
         <w:t>,</w:t>
@@ -512,7 +415,7 @@
                     <pic:cNvPicPr/>
                   </pic:nvPicPr>
                   <pic:blipFill>
-                    <a:blip r:embed="rId14"/>
+                    <a:blip r:embed="rId11"/>
                     <a:stretch>
                       <a:fillRect/>
                     </a:stretch>
@@ -558,7 +461,13 @@
         <w:t xml:space="preserve"> lake</w:t>
       </w:r>
       <w:r>
-        <w:t xml:space="preserve"> food web. The left panel shows the original adjacency matrix, where each black dot corresponds to an observed predator–prey link, with species ordered by body mass. The right panel overlays the model’s predictions on the same structure: green dots highlight true positives (links correctly predicted), red squares indicate false positives (predicted but not observed), black dots represent training links, and grey crosses mark false negatives (observed but missed). This comparison is important because it provides a visual validation of the model’s performance at the level of individual interactions, showing not only overall accuracy but also where systematic errors occur. The matrices were generated by training the </w:t>
+        <w:t xml:space="preserve"> food web. The left panel shows the original adjacency matrix, where each black dot corresponds to an observed predator</w:t>
+      </w:r>
+      <w:r>
+        <w:t>-</w:t>
+      </w:r>
+      <w:r>
+        <w:t xml:space="preserve">prey link, with species ordered by body mass. The right panel overlays the model’s predictions on the same structure: green dots highlight true positives (links correctly predicted), red squares indicate false positives (predicted but not observed), black dots represent training links, and grey crosses mark false negatives (observed but missed). This comparison is important because it provides a visual validation of the model’s performance at the level of individual interactions, showing not only overall accuracy but also where systematic errors occur. The matrices were generated by training the </w:t>
       </w:r>
       <w:proofErr w:type="spellStart"/>
       <w:r>
@@ -566,7 +475,10 @@
       </w:r>
       <w:proofErr w:type="spellEnd"/>
       <w:r>
-        <w:t>–Lehman Neural Machine (WLNM) on a subset of links from this food web, then testing the model’s predictions against the withheld interactions, with results displayed in a predator-by-prey grid.</w:t>
+        <w:t>-</w:t>
+      </w:r>
+      <w:r>
+        <w:t>Lehman Neural Machine (WLNM) on a subset of links from this food web, then testing the model’s predictions against the withheld interactions, with results displayed in a predator-by-prey grid.</w:t>
       </w:r>
       <w:r>
         <w:br w:type="page"/>
@@ -594,7 +506,7 @@
                     <pic:cNvPicPr/>
                   </pic:nvPicPr>
                   <pic:blipFill>
-                    <a:blip r:embed="rId15"/>
+                    <a:blip r:embed="rId12"/>
                     <a:stretch>
                       <a:fillRect/>
                     </a:stretch>
@@ -623,7 +535,13 @@
         <w:t>Figure 5.</w:t>
       </w:r>
       <w:r>
-        <w:t xml:space="preserve"> This figure presents a comparison between the observed and predicted predator–prey interactions in the </w:t>
+        <w:t xml:space="preserve"> This figure presents a comparison between the observed and predicted predator</w:t>
+      </w:r>
+      <w:r>
+        <w:t>-</w:t>
+      </w:r>
+      <w:r>
+        <w:t xml:space="preserve">prey interactions in the </w:t>
       </w:r>
       <w:r>
         <w:rPr>
@@ -660,7 +578,7 @@
                     <pic:cNvPicPr/>
                   </pic:nvPicPr>
                   <pic:blipFill>
-                    <a:blip r:embed="rId16"/>
+                    <a:blip r:embed="rId13"/>
                     <a:stretch>
                       <a:fillRect/>
                     </a:stretch>
@@ -698,7 +616,13 @@
         <w:t>Isolated stream 877 August 2003</w:t>
       </w:r>
       <w:r>
-        <w:t xml:space="preserve"> food web. The left panel shows the adjacency matrix, with black dots indicating observed predator–prey links arranged by body mass. The right panel overlays WLNM’s predictions: true positives (green dots) are correctly predicted links, false positives (red squares) are predicted but not observed, black dots denote links used in training, and grey crosses indicate observed interactions the model failed to predict. This visualization is important as it highlights how effectively the model captures the feeding structure of this stream ecosystem, while also revealing systematic errors, such as clusters of missed or over-predicted links. The matrices were generated by training WLNM on a portion of the observed interactions and validating predictions against withheld links.</w:t>
+        <w:t xml:space="preserve"> food web. The left panel shows the adjacency matrix, with black dots indicating observed predator</w:t>
+      </w:r>
+      <w:r>
+        <w:t>-</w:t>
+      </w:r>
+      <w:r>
+        <w:t>prey links arranged by body mass. The right panel overlays WLNM’s predictions: true positives (green dots) are correctly predicted links, false positives (red squares) are predicted but not observed, black dots denote links used in training, and grey crosses indicate observed interactions the model failed to predict. This visualization is important as it highlights how effectively the model captures the feeding structure of this stream ecosystem, while also revealing systematic errors, such as clusters of missed or over-predicted links. The matrices were generated by training WLNM on a portion of the observed interactions and validating predictions against withheld links.</w:t>
       </w:r>
       <w:r>
         <w:br w:type="page"/>
@@ -726,7 +650,7 @@
                     <pic:cNvPicPr/>
                   </pic:nvPicPr>
                   <pic:blipFill>
-                    <a:blip r:embed="rId17"/>
+                    <a:blip r:embed="rId14"/>
                     <a:stretch>
                       <a:fillRect/>
                     </a:stretch>
@@ -764,7 +688,13 @@
         <w:t>Big Hopu lake</w:t>
       </w:r>
       <w:r>
-        <w:t xml:space="preserve"> food web. The left panel shows the adjacency matrix of observed interactions, where black dots represent predator–prey links arranged by species body mass. The right panel overlays WLNM’s predictions: true positives (green dots) indicate links that were correctly predicted, false positives (red squares) represent predicted but unobserved links, training links (black dots) were used to fit the model, and false negatives (grey crosses) show observed interactions that the model failed to recover. This visualization is important because it highlights both the successes and errors of the model in capturing the trophic structure of this lake ecosystem. The figure was generated by training WLNM on a subset of observed interactions and testing its predictions against withheld links.</w:t>
+        <w:t xml:space="preserve"> food web. The left panel shows the adjacency matrix of observed interactions, where black dots represent predator</w:t>
+      </w:r>
+      <w:r>
+        <w:t>-</w:t>
+      </w:r>
+      <w:r>
+        <w:t>prey links arranged by species body mass. The right panel overlays WLNM’s predictions: true positives (green dots) indicate links that were correctly predicted, false positives (red squares) represent predicted but unobserved links, training links (black dots) were used to fit the model, and false negatives (grey crosses) show observed interactions that the model failed to recover. This visualization is important because it highlights both the successes and errors of the model in capturing the trophic structure of this lake ecosystem. The figure was generated by training WLNM on a subset of observed interactions and testing its predictions against withheld links.</w:t>
       </w:r>
       <w:r>
         <w:br w:type="page"/>
@@ -792,7 +722,7 @@
                     <pic:cNvPicPr/>
                   </pic:nvPicPr>
                   <pic:blipFill>
-                    <a:blip r:embed="rId18"/>
+                    <a:blip r:embed="rId15"/>
                     <a:stretch>
                       <a:fillRect/>
                     </a:stretch>
@@ -834,7 +764,10 @@
       </w:r>
       <w:proofErr w:type="spellEnd"/>
       <w:r>
-        <w:t xml:space="preserve">–Lehman Neural Machine (WLNM) measured by the Area Under the ROC Curve (AUC) across multiple food webs. Each colored bar represents a food web, with the height indicating the mean AUC score over 10 independent runs. Error bars display the minimum and maximum values obtained, providing a sense of variability and robustness. Most food webs achieve high AUC scores close to 1.0, suggesting strong discriminative ability of the model, while a few </w:t>
+        <w:t>-</w:t>
+      </w:r>
+      <w:r>
+        <w:t xml:space="preserve">Lehman Neural Machine (WLNM) measured by the Area Under the ROC Curve (AUC) across multiple food webs. Each colored bar represents a food web, with the height indicating the mean AUC score over 10 independent runs. Error bars display the minimum and maximum values obtained, providing a sense of variability and robustness. Most food webs achieve high AUC scores close to 1.0, suggesting strong discriminative ability of the model, while a few </w:t>
       </w:r>
       <w:proofErr w:type="gramStart"/>
       <w:r>
@@ -873,7 +806,7 @@
                     <pic:cNvPicPr/>
                   </pic:nvPicPr>
                   <pic:blipFill>
-                    <a:blip r:embed="rId19"/>
+                    <a:blip r:embed="rId16"/>
                     <a:stretch>
                       <a:fillRect/>
                     </a:stretch>
@@ -915,7 +848,10 @@
       </w:r>
       <w:proofErr w:type="spellEnd"/>
       <w:r>
-        <w:t xml:space="preserve">–Lehman Neural Machine (WLNM) across multiple food webs. Each colored bar corresponds to a single food web, with the bar height showing the mean Precision score over 10 independent runs, while error bars represent the minimum and maximum scores obtained. Precision reflects the proportion of predicted links that are </w:t>
+        <w:t>-</w:t>
+      </w:r>
+      <w:r>
+        <w:t xml:space="preserve">Lehman Neural Machine (WLNM) across multiple food webs. Each colored bar corresponds to a single food web, with the bar height showing the mean Precision score over 10 independent runs, while error bars represent the minimum and maximum scores obtained. Precision reflects the proportion of predicted links that are </w:t>
       </w:r>
       <w:proofErr w:type="gramStart"/>
       <w:r>
@@ -962,7 +898,7 @@
                     <pic:cNvPicPr/>
                   </pic:nvPicPr>
                   <pic:blipFill>
-                    <a:blip r:embed="rId20"/>
+                    <a:blip r:embed="rId17"/>
                     <a:stretch>
                       <a:fillRect/>
                     </a:stretch>
@@ -996,7 +932,13 @@
         <w:t>Figure 10.</w:t>
       </w:r>
       <w:r>
-        <w:t xml:space="preserve"> This figure displays Precision–Recall (PR) curves for the AEW17 terrestrial belowground food web (N = 145 nodes). The solid blue line corresponds to links included during training (unseen = false), while the dashed orange line represents predictions on unseen links withheld for testing. PR curves are useful because they show the trade-off between Precision (avoiding false positives) and Recall (capturing true positives) across different classification thresholds. The figure reveals that while WLNM performs strongly on seen interactions, its performance declines on unseen links, reflecting the challenge of generalizing predictions to unobserved parts of the network. The curves were generated by computing Precision and Recall at varying decision thresholds on both training and testing sets.</w:t>
+        <w:t xml:space="preserve"> This figure displays Precision</w:t>
+      </w:r>
+      <w:r>
+        <w:t>-</w:t>
+      </w:r>
+      <w:r>
+        <w:t>Recall (PR) curves for the AEW17 terrestrial belowground food web (N = 145 nodes). The solid blue line corresponds to links included during training (unseen = false), while the dashed orange line represents predictions on unseen links withheld for testing. PR curves are useful because they show the trade-off between Precision (avoiding false positives) and Recall (capturing true positives) across different classification thresholds. The figure reveals that while WLNM performs strongly on seen interactions, its performance declines on unseen links, reflecting the challenge of generalizing predictions to unobserved parts of the network. The curves were generated by computing Precision and Recall at varying decision thresholds on both training and testing sets.</w:t>
       </w:r>
       <w:r>
         <w:rPr>
@@ -1027,7 +969,7 @@
                     <pic:cNvPicPr/>
                   </pic:nvPicPr>
                   <pic:blipFill>
-                    <a:blip r:embed="rId21"/>
+                    <a:blip r:embed="rId18"/>
                     <a:stretch>
                       <a:fillRect/>
                     </a:stretch>
@@ -1061,7 +1003,13 @@
         <w:t>Figure 11.</w:t>
       </w:r>
       <w:r>
-        <w:t xml:space="preserve"> This figure shows Precision–Recall (PR) curves for the AEW03 terrestrial belowground food web (N = 122 nodes). The solid blue line reflects model performance on links included in the training data (unseen = false), while the dashed orange line shows predictions on links withheld during testing (unseen = true). PR curves reveal the balance between Precision</w:t>
+        <w:t xml:space="preserve"> This figure shows Precision</w:t>
+      </w:r>
+      <w:r>
+        <w:t>-</w:t>
+      </w:r>
+      <w:r>
+        <w:t>Recall (PR) curves for the AEW03 terrestrial belowground food web (N = 122 nodes). The solid blue line reflects model performance on links included in the training data (unseen = false), while the dashed orange line shows predictions on links withheld during testing (unseen = true). PR curves reveal the balance between Precision</w:t>
       </w:r>
       <w:r>
         <w:t>,</w:t>
@@ -1116,7 +1064,7 @@
                     <pic:cNvPicPr/>
                   </pic:nvPicPr>
                   <pic:blipFill>
-                    <a:blip r:embed="rId22"/>
+                    <a:blip r:embed="rId19"/>
                     <a:stretch>
                       <a:fillRect/>
                     </a:stretch>
@@ -1145,7 +1093,13 @@
         <w:t>Figure 12.</w:t>
       </w:r>
       <w:r>
-        <w:t xml:space="preserve"> This figure shows the two most frequent positive enclosing subgraphs identified during the WLNM encoding process. Each subgraph centers on a target link (highlighted by the red diamond nodes), with orange circular nodes representing neighboring species included in the enclosing structure. The left subgraph (count = 170) and the right subgraph (count = 174) represent recurring local patterns around predator–prey interactions labeled as positive. Visualizing enclosing subgraphs is important because they reveal the building blocks used by WLNM to learn predictive features: they capture the structural context of interactions, including shared neighbors and connectivity patterns. By analyzing these subgraphs, we can better understand why the model classifies certain pairs as likely interacting. These subgraphs were generated by extracting local neighborhoods around positive links and encoding them with the </w:t>
+        <w:t xml:space="preserve"> This figure shows the two most frequent positive enclosing subgraphs identified during the WLNM encoding process. Each subgraph centers on a target link (highlighted by the red diamond nodes), with orange circular nodes representing neighboring species included in the enclosing structure. The left subgraph (count = 170) and the right subgraph (count = 174) represent recurring local patterns around predator</w:t>
+      </w:r>
+      <w:r>
+        <w:t>-</w:t>
+      </w:r>
+      <w:r>
+        <w:t xml:space="preserve">prey interactions labeled as positive. Visualizing enclosing subgraphs is important because they reveal the building blocks used by WLNM to learn predictive features: they capture the structural context of interactions, including shared neighbors and connectivity patterns. By analyzing these subgraphs, we can better understand why the model classifies certain pairs as likely interacting. These subgraphs were generated by extracting local neighborhoods around positive links and encoding them with the </w:t>
       </w:r>
       <w:proofErr w:type="spellStart"/>
       <w:r>
@@ -1153,7 +1107,10 @@
       </w:r>
       <w:proofErr w:type="spellEnd"/>
       <w:r>
-        <w:t>–Lehman labeling procedure.</w:t>
+        <w:t>-</w:t>
+      </w:r>
+      <w:r>
+        <w:t>Lehman labeling procedure.</w:t>
       </w:r>
       <w:r>
         <w:rPr>
@@ -1190,7 +1147,7 @@
                     <pic:cNvPicPr/>
                   </pic:nvPicPr>
                   <pic:blipFill>
-                    <a:blip r:embed="rId23"/>
+                    <a:blip r:embed="rId20"/>
                     <a:stretch>
                       <a:fillRect/>
                     </a:stretch>
@@ -1224,7 +1181,13 @@
         <w:t>Figure 13.</w:t>
       </w:r>
       <w:r>
-        <w:t xml:space="preserve"> This figure displays two examples of enclosing subgraphs corresponding to negative samples, where the central pair of species (shown as red diamond nodes) does not represent an observed predator–prey interaction. The surrounding orange circular nodes represent the local neighborhood extracted to form the enclosing subgraph. These negative subgraphs are important because they provide contrastive training examples for the </w:t>
+        <w:t xml:space="preserve"> This figure displays two examples of enclosing subgraphs corresponding to negative samples, where the central pair of species (shown as red diamond nodes) does not represent an observed predator</w:t>
+      </w:r>
+      <w:r>
+        <w:t>-</w:t>
+      </w:r>
+      <w:r>
+        <w:t xml:space="preserve">prey interaction. The surrounding orange circular nodes represent the local neighborhood extracted to form the enclosing subgraph. These negative subgraphs are important because they provide contrastive training examples for the </w:t>
       </w:r>
       <w:proofErr w:type="spellStart"/>
       <w:r>
@@ -1232,7 +1195,10 @@
       </w:r>
       <w:proofErr w:type="spellEnd"/>
       <w:r>
-        <w:t xml:space="preserve">–Lehman Neural Machine (WLNM), allowing the model to learn not only the structural patterns of true interactions but also those of non-interacting pairs. The two examples shown here were randomly selected from the pool of negative samples, highlighting the structural diversity of non-links in food webs. These subgraphs were generated by sampling species pairs without observed interactions, extracting their surrounding neighborhood, and encoding them using the </w:t>
+        <w:t>-</w:t>
+      </w:r>
+      <w:r>
+        <w:t xml:space="preserve">Lehman Neural Machine (WLNM), allowing the model to learn not only the structural patterns of true interactions but also those of non-interacting pairs. The two examples shown here were randomly selected from the pool of negative samples, highlighting the structural diversity of non-links in food webs. These subgraphs were generated by sampling species pairs without observed interactions, extracting their surrounding neighborhood, and encoding them using the </w:t>
       </w:r>
       <w:proofErr w:type="spellStart"/>
       <w:r>
@@ -1240,7 +1206,10 @@
       </w:r>
       <w:proofErr w:type="spellEnd"/>
       <w:r>
-        <w:t>–Lehman labeling procedure.</w:t>
+        <w:t>-</w:t>
+      </w:r>
+      <w:r>
+        <w:t>Lehman labeling procedure.</w:t>
       </w:r>
       <w:r>
         <w:rPr>
@@ -1277,7 +1246,7 @@
                     <pic:cNvPicPr/>
                   </pic:nvPicPr>
                   <pic:blipFill rotWithShape="1">
-                    <a:blip r:embed="rId24"/>
+                    <a:blip r:embed="rId21"/>
                     <a:srcRect l="29664"/>
                     <a:stretch>
                       <a:fillRect/>
@@ -1357,7 +1326,7 @@
                     <pic:cNvPicPr/>
                   </pic:nvPicPr>
                   <pic:blipFill>
-                    <a:blip r:embed="rId25" cstate="print">
+                    <a:blip r:embed="rId22" cstate="print">
                       <a:extLst>
                         <a:ext uri="{28A0092B-C50C-407E-A947-70E740481C1C}">
                           <a14:useLocalDpi xmlns:a14="http://schemas.microsoft.com/office/drawing/2010/main" val="0"/>
@@ -1405,7 +1374,10 @@
       </w:r>
       <w:proofErr w:type="spellEnd"/>
       <w:r>
-        <w:t xml:space="preserve">–Lehman Neural Machine (WLNM) pipeline as applied to food web link prediction. The process begins with splitting the network into training and test sets, followed by negative sampling where ecologically meaningful non-links are selected. Next, enclosing subgraphs are extracted around candidate pairs, encoded using </w:t>
+        <w:t>-</w:t>
+      </w:r>
+      <w:r>
+        <w:t xml:space="preserve">Lehman Neural Machine (WLNM) pipeline as applied to food web link prediction. The process begins with splitting the network into training and test sets, followed by negative sampling where ecologically meaningful non-links are selected. Next, enclosing subgraphs are extracted around candidate pairs, encoded using </w:t>
       </w:r>
       <w:proofErr w:type="spellStart"/>
       <w:r>
@@ -1413,7 +1385,10 @@
       </w:r>
       <w:proofErr w:type="spellEnd"/>
       <w:r>
-        <w:t>–Lehman relabeling, and transformed into feature vectors. These representations are then used to train and evaluate a machine learning classifier. The flowchart is important because it provides a clear and systematic overview of how the pipeline operates, showing where ecological constraints (e.g., body mass filtering in negative sampling) are introduced and how subgraph-level encoding leads into predictive modeling. The diagram was generated by formalizing the methodological steps into a process flow to ensure clarity and reproducibility.</w:t>
+        <w:t>-</w:t>
+      </w:r>
+      <w:r>
+        <w:t>Lehman relabeling, and transformed into feature vectors. These representations are then used to train and evaluate a machine learning classifier. The flowchart is important because it provides a clear and systematic overview of how the pipeline operates, showing where ecological constraints (e.g., body mass filtering in negative sampling) are introduced and how subgraph-level encoding leads into predictive modeling. The diagram was generated by formalizing the methodological steps into a process flow to ensure clarity and reproducibility.</w:t>
       </w:r>
       <w:r>
         <w:rPr>
@@ -1428,171 +1403,89 @@
       </w:pPr>
       <w:r>
         <w:lastRenderedPageBreak/>
-        <w:t>Results</w:t>
-      </w:r>
-    </w:p>
-    <w:p>
-      <w:r>
-        <w:t xml:space="preserve">Performance of </w:t>
-      </w:r>
-      <w:r>
-        <w:t>eight</w:t>
-      </w:r>
-      <w:r>
-        <w:t xml:space="preserve"> WLNM variants was evaluated on a corpus of food webs spanning multiple ecosystem types. The variants considered were the original WLNM (baseline), WLNM with an ecology-aware negative links strategy, WLNM with directed subgraph expansion and encoding, and the combination of directed encoding with the negative strategy. Unless stated otherwise, an 80% training ratio was used as the primary setting, repeated executions within each food web were averaged to yield a single estimate per web, and summary statistics were computed across the full set of webs.</w:t>
-      </w:r>
-    </w:p>
-    <w:p>
-      <w:r>
-        <w:t>For each variant, per-web Area Under the ROC Curve (AUC), Precision, Recall, and F1 were computed and inspected as functions of network size (number of nodes) and ecosystem type. Comparisons among variants were performed at the food-web level using paired analyses; distributional shifts were summarized by median (and interquartile range) differences with 95% confidence intervals obtained by bootstrap resampling, and statistical significance was assessed with paired Wilcoxon signed-rank tests. Effect sizes were reported using Cliff’s delta to complement p-values. To facilitate interpretation, reference lines corresponding to random-classifier AUC (0.5) and the cross-web mean for each metric were overlaid on the point plots, and ecosystem-stratified views were provided where relevant.</w:t>
-      </w:r>
-    </w:p>
-    <w:p>
-      <w:r>
-        <w:t>All figures report one point per food web at the chosen training ratio, ensuring equal weighting across webs and preventing repeated splits from inflating sample sizes. Where appropriate, sensitivity to network size was examined by relating scores to node count, and robustness to stochastic variation was addressed by averaging across repetitions before aggregation. Detailed per-web values are provided in supplementary tables; main text figures present aggregated patterns and paired differences that are directly comparable across the four variants.</w:t>
-      </w:r>
-    </w:p>
-    <w:p>
-      <w:pPr>
-        <w:pStyle w:val="NormalWeb"/>
-      </w:pPr>
-    </w:p>
-    <w:p>
-      <w:pPr>
-        <w:pStyle w:val="NormalWeb"/>
-      </w:pPr>
-    </w:p>
-    <w:p>
-      <w:pPr>
-        <w:pStyle w:val="NormalWeb"/>
-      </w:pPr>
-    </w:p>
-    <w:p>
-      <w:pPr>
-        <w:pStyle w:val="Heading2"/>
-      </w:pPr>
-      <w:r>
-        <w:t>Predictive Performance Across Ecosystems</w:t>
-      </w:r>
-    </w:p>
-    <w:p>
-      <w:r>
-        <w:t xml:space="preserve">We evaluated the WLNM model on 30+ food webs representing diverse ecological systems. The model consistently achieved high predictive performance across datasets, with </w:t>
-      </w:r>
-      <w:r>
+        <w:t>EXPERIMENTAL RESULTS</w:t>
+      </w:r>
+    </w:p>
+    <w:p>
+      <w:r>
+        <w:t xml:space="preserve">Eight variants of the </w:t>
+      </w:r>
+      <w:proofErr w:type="spellStart"/>
+      <w:r>
+        <w:t>Weisfeiler</w:t>
+      </w:r>
+      <w:proofErr w:type="spellEnd"/>
+      <w:r>
+        <w:t>-</w:t>
+      </w:r>
+      <w:r>
+        <w:t>Lehman Neural Machine (WLNM) were evaluated on a corpus of trophic networks spanning multiple ecosystem types. The variants comprised the original WLNM (baseline), a version with an ecology-aware negative-link strategy, a directed formulation with directed subgraph expansion and encoding, and the combination of directed encoding with the ecology-aware negatives. Unless otherwise noted, a training ratio of 80% was adopted as the primary setting. For each food web, multiple executions were performed and averaged to obtain a single estimate per web, after which summary statistics were computed across the full collection of webs.</w:t>
+      </w:r>
+    </w:p>
+    <w:p>
+      <w:r>
+        <w:t xml:space="preserve">For every variant, Area Under the ROC Curve (AUC), Precision, Recall, and F1 were computed per web and examined as functions of network size and ecosystem type. Comparisons were conducted at the food-web level using paired analyses; distributional shifts were </w:t>
+      </w:r>
+      <w:proofErr w:type="spellStart"/>
+      <w:r>
+        <w:t>summarised</w:t>
+      </w:r>
+      <w:proofErr w:type="spellEnd"/>
+      <w:r>
+        <w:t xml:space="preserve"> by median differences with interquartile ranges, and 95% confidence intervals were obtained through bootstrap resampling. Statistical significance was assessed with paired Wilcoxon signed-rank tests, and effect sizes were reported using Cliff’s delta to complement p-values. To aid interpretation, reference lines corresponding to the random-classifier AUC (0.5) and to cross-web means were overlaid on point plots, and ecosystem-stratified views were produced where relevant. One point per food web was reported for the chosen training ratio, thereby ensuring equal weighting across webs and preventing repeated splits from inflating the effective sample size. Sensitivity to network size was examined by relating scores to node count, and robustness to stochastic variation was addressed by averaging across repetitions prior to aggregation. Detailed per-web values are provided in the Supplementary Tables, while the main figures show aggregated patterns and paired differences that are directly comparable across variants.</w:t>
+      </w:r>
+    </w:p>
+    <w:p>
+      <w:r>
+        <w:t>A directed WLNM with role-aware (predator</w:t>
+      </w:r>
+      <w:r>
+        <w:t>-</w:t>
+      </w:r>
+      <w:r>
+        <w:t xml:space="preserve">prey) subgraph expansion and encoding was implemented to respect trophic directionality, and an ecology-aware negative-link strategy was introduced to constrain negatives to biologically plausible non-interactions. These two modifications were also combined, and their </w:t>
+      </w:r>
+      <w:proofErr w:type="spellStart"/>
+      <w:r>
+        <w:t>behaviour</w:t>
+      </w:r>
+      <w:proofErr w:type="spellEnd"/>
+      <w:r>
+        <w:t xml:space="preserve"> was contrasted with the original undirected WLNM that employs random negative sampling. In addition, three auxiliary investigations were conducted: a sweep of training ratios from 10% to 90% to study data-efficiency and overfitting, an analysis excluding very small networks to assess size effects, and an exploration of rare-link emphasis via a master-web approach that </w:t>
+      </w:r>
+      <w:proofErr w:type="spellStart"/>
+      <w:r>
+        <w:t>prioritises</w:t>
+      </w:r>
+      <w:proofErr w:type="spellEnd"/>
+      <w:r>
+        <w:t xml:space="preserve"> scarce interactions. Finally, a backbone-aware setting was examined by applying a network-backbone filtration prior to WLNM training and evaluation.</w:t>
+      </w:r>
+    </w:p>
+    <w:p>
+      <w:pPr>
         <w:rPr>
           <w:rFonts w:eastAsiaTheme="majorEastAsia"/>
           <w:b/>
           <w:bCs/>
         </w:rPr>
-        <w:t>mean AUC values exceeding 0.90</w:t>
-      </w:r>
-      <w:r>
-        <w:t xml:space="preserve"> for </w:t>
-      </w:r>
-      <w:proofErr w:type="gramStart"/>
-      <w:r>
-        <w:t>the majority of</w:t>
-      </w:r>
-      <w:proofErr w:type="gramEnd"/>
-      <w:r>
-        <w:t xml:space="preserve"> networks. Notably, several food webs such as </w:t>
-      </w:r>
-      <w:r>
-        <w:rPr>
-          <w:rFonts w:eastAsiaTheme="majorEastAsia"/>
-          <w:i/>
-          <w:iCs/>
-        </w:rPr>
-        <w:t>Brook Trout Lake</w:t>
-      </w:r>
-      <w:r>
-        <w:t xml:space="preserve">, </w:t>
-      </w:r>
-      <w:r>
-        <w:rPr>
-          <w:rFonts w:eastAsiaTheme="majorEastAsia"/>
-          <w:i/>
-          <w:iCs/>
-        </w:rPr>
-        <w:t xml:space="preserve">Grand </w:t>
-      </w:r>
-      <w:proofErr w:type="spellStart"/>
-      <w:r>
-        <w:rPr>
-          <w:rFonts w:eastAsiaTheme="majorEastAsia"/>
-          <w:i/>
-          <w:iCs/>
-        </w:rPr>
-        <w:t>Caricaie</w:t>
-      </w:r>
-      <w:proofErr w:type="spellEnd"/>
-      <w:r>
-        <w:t xml:space="preserve">, and </w:t>
-      </w:r>
-      <w:r>
-        <w:rPr>
-          <w:rFonts w:eastAsiaTheme="majorEastAsia"/>
-          <w:i/>
-          <w:iCs/>
-        </w:rPr>
-        <w:t>AEM17</w:t>
-      </w:r>
-      <w:r>
-        <w:t xml:space="preserve"> achieved </w:t>
-      </w:r>
+      </w:pPr>
       <w:r>
         <w:rPr>
           <w:rFonts w:eastAsiaTheme="majorEastAsia"/>
           <w:b/>
           <w:bCs/>
         </w:rPr>
-        <w:t>perfect or near-perfect AUC (1.00 ± 0.00)</w:t>
-      </w:r>
-      <w:r>
-        <w:t>, indicating exceptional discriminative ability.</w:t>
-      </w:r>
-    </w:p>
-    <w:p>
-      <w:r>
-        <w:lastRenderedPageBreak/>
-        <w:t xml:space="preserve">AUC variability was more pronounced in mid-sized and sparse food webs such as </w:t>
+        <w:t>Predictive</w:t>
       </w:r>
       <w:r>
         <w:rPr>
+          <w:rStyle w:val="Strong"/>
           <w:rFonts w:eastAsiaTheme="majorEastAsia"/>
-          <w:i/>
-          <w:iCs/>
+          <w:b w:val="0"/>
+          <w:bCs w:val="0"/>
         </w:rPr>
-        <w:t>CGP1</w:t>
-      </w:r>
-      <w:r>
-        <w:t xml:space="preserve"> and </w:t>
-      </w:r>
-      <w:r>
-        <w:rPr>
-          <w:rFonts w:eastAsiaTheme="majorEastAsia"/>
-          <w:i/>
-          <w:iCs/>
-        </w:rPr>
-        <w:t>Broad Stream</w:t>
-      </w:r>
-      <w:r>
-        <w:t>, likely due to reduced link density and higher noise-to-signal ratios. These results suggest that WLNM maintains robust performance even in relatively challenging ecological scenarios.</w:t>
-      </w:r>
-    </w:p>
-    <w:p/>
-    <w:p>
-      <w:pPr>
-        <w:pStyle w:val="Heading2"/>
-      </w:pPr>
-      <w:r>
-        <w:t>Precision Score Distribution</w:t>
-      </w:r>
-    </w:p>
-    <w:p>
-      <w:r>
-        <w:t xml:space="preserve">In addition to AUC, we evaluated </w:t>
+        <w:t xml:space="preserve"> </w:t>
       </w:r>
       <w:r>
         <w:rPr>
@@ -1600,708 +1493,311 @@
           <w:b/>
           <w:bCs/>
         </w:rPr>
-        <w:t>precision scores</w:t>
-      </w:r>
-      <w:r>
-        <w:t xml:space="preserve"> across 10 randomized runs. While AUC reflects global ranking quality, precision emphasizes how often high-confidence predictions are correct</w:t>
-      </w:r>
-      <w:r>
-        <w:t>,</w:t>
-      </w:r>
-      <w:r>
-        <w:t xml:space="preserve"> a critical metric for ecological applications where false positives can mislead inference.</w:t>
-      </w:r>
-    </w:p>
-    <w:p>
-      <w:pPr>
-        <w:pStyle w:val="ListParagraph"/>
-        <w:numPr>
-          <w:ilvl w:val="0"/>
-          <w:numId w:val="4"/>
-        </w:numPr>
-      </w:pPr>
-      <w:r>
+        <w:t>performance across ecosystems.</w:t>
+      </w:r>
+    </w:p>
+    <w:p>
+      <w:r>
+        <w:t xml:space="preserve">Evaluation on more than thirty food webs indicated that high predictive performance was maintained across diverse ecological systems. Mean AUC values exceeded 0.90 for </w:t>
+      </w:r>
+      <w:proofErr w:type="gramStart"/>
+      <w:r>
+        <w:t>the majority of</w:t>
+      </w:r>
+      <w:proofErr w:type="gramEnd"/>
+      <w:r>
+        <w:t xml:space="preserve"> networks. Several webs, including Brook Trout Lake, Grand </w:t>
+      </w:r>
+      <w:proofErr w:type="spellStart"/>
+      <w:r>
+        <w:t>Caricaie</w:t>
+      </w:r>
+      <w:proofErr w:type="spellEnd"/>
+      <w:r>
+        <w:t xml:space="preserve">, and AEM17, achieved perfect or near-perfect AUC (1.00 ± 0.00), which suggests that the ranking of true versus non-observed interactions was </w:t>
+      </w:r>
+      <w:r>
+        <w:lastRenderedPageBreak/>
+        <w:t>recovered with exceptional fidelity. Greater variability in AUC was observed for mid-sized and sparser webs such as CGP1 and Broad Stream, an outcome that is consistent with lower link density and higher noise-to-signal ratios. Overall, robust performance was retained in relatively challenging ecological scenarios.</w:t>
+      </w:r>
+    </w:p>
+    <w:p>
+      <w:pPr>
         <w:rPr>
+          <w:rStyle w:val="Strong"/>
+        </w:rPr>
+      </w:pPr>
+      <w:r>
+        <w:rPr>
+          <w:rStyle w:val="Strong"/>
           <w:rFonts w:eastAsiaTheme="majorEastAsia"/>
-          <w:b/>
-          <w:bCs/>
         </w:rPr>
-        <w:t>High precision</w:t>
-      </w:r>
-      <w:r>
-        <w:t xml:space="preserve"> was observed in food webs such as </w:t>
-      </w:r>
+        <w:t xml:space="preserve">Precision </w:t>
+      </w:r>
+      <w:proofErr w:type="spellStart"/>
       <w:r>
         <w:rPr>
+          <w:rStyle w:val="Strong"/>
           <w:rFonts w:eastAsiaTheme="majorEastAsia"/>
-          <w:i/>
-          <w:iCs/>
         </w:rPr>
-        <w:t>Brook Trout Lake</w:t>
-      </w:r>
-      <w:r>
-        <w:t xml:space="preserve">, </w:t>
-      </w:r>
+        <w:t>behaviour</w:t>
+      </w:r>
+      <w:proofErr w:type="spellEnd"/>
       <w:r>
         <w:rPr>
+          <w:rStyle w:val="Strong"/>
           <w:rFonts w:eastAsiaTheme="majorEastAsia"/>
-          <w:i/>
-          <w:iCs/>
         </w:rPr>
-        <w:t>AEM17</w:t>
-      </w:r>
-      <w:r>
-        <w:t xml:space="preserve">, and </w:t>
-      </w:r>
+        <w:t xml:space="preserve"> and reliability of high-confidence predictions.</w:t>
+      </w:r>
+    </w:p>
+    <w:p>
+      <w:r>
+        <w:t xml:space="preserve">Precision distributions over ten </w:t>
+      </w:r>
+      <w:proofErr w:type="spellStart"/>
+      <w:r>
+        <w:t>randomised</w:t>
+      </w:r>
+      <w:proofErr w:type="spellEnd"/>
+      <w:r>
+        <w:t xml:space="preserve"> runs indicated that high-confidence predictions were typically reliable in structurally cohesive webs. For example, Brook Trout Lake, AEM17, and Grand </w:t>
+      </w:r>
+      <w:proofErr w:type="spellStart"/>
+      <w:r>
+        <w:t>Caricaie</w:t>
+      </w:r>
+      <w:proofErr w:type="spellEnd"/>
+      <w:r>
+        <w:t xml:space="preserve"> produced mean precision scores near 1.00 at the operating threshold used, whereas CGP1 and Broad Stream exhibited lower and more variable precision with standard deviations exceeding 0.3. These patterns suggest that ecological metadata and role-aware sampling reduce spurious suggestions in well-structured systems, while calibration becomes more difficult in webs </w:t>
+      </w:r>
+      <w:proofErr w:type="spellStart"/>
+      <w:r>
+        <w:t>characterised</w:t>
+      </w:r>
+      <w:proofErr w:type="spellEnd"/>
+      <w:r>
+        <w:t xml:space="preserve"> by ambiguity or sparse evidence.</w:t>
+      </w:r>
+    </w:p>
+    <w:p>
       <w:r>
         <w:rPr>
+          <w:rStyle w:val="Strong"/>
           <w:rFonts w:eastAsiaTheme="majorEastAsia"/>
-          <w:i/>
-          <w:iCs/>
         </w:rPr>
-        <w:t xml:space="preserve">Grand </w:t>
-      </w:r>
-      <w:proofErr w:type="spellStart"/>
+        <w:t>Precision</w:t>
+      </w:r>
       <w:r>
         <w:rPr>
+          <w:rStyle w:val="Strong"/>
           <w:rFonts w:eastAsiaTheme="majorEastAsia"/>
-          <w:i/>
-          <w:iCs/>
         </w:rPr>
-        <w:t>Caricaie</w:t>
-      </w:r>
-      <w:proofErr w:type="spellEnd"/>
-      <w:r>
-        <w:t xml:space="preserve">, which achieved </w:t>
+        <w:t>-</w:t>
       </w:r>
       <w:r>
         <w:rPr>
+          <w:rStyle w:val="Strong"/>
           <w:rFonts w:eastAsiaTheme="majorEastAsia"/>
-          <w:b/>
-          <w:bCs/>
         </w:rPr>
-        <w:t>mean precision scores of 1.00</w:t>
-      </w:r>
-      <w:r>
-        <w:t>, indicating near-perfect predictions at the chosen threshold.</w:t>
-      </w:r>
-    </w:p>
-    <w:p>
-      <w:pPr>
-        <w:pStyle w:val="ListParagraph"/>
-        <w:numPr>
-          <w:ilvl w:val="0"/>
-          <w:numId w:val="4"/>
-        </w:numPr>
-      </w:pPr>
+        <w:t>recall trade-offs and test-set regimes.</w:t>
+      </w:r>
+    </w:p>
+    <w:p>
+      <w:r>
+        <w:t>Precision</w:t>
+      </w:r>
+      <w:r>
+        <w:t>-</w:t>
+      </w:r>
+      <w:r>
+        <w:t xml:space="preserve">recall curves were inspected to </w:t>
+      </w:r>
+      <w:proofErr w:type="spellStart"/>
+      <w:r>
+        <w:t>characterise</w:t>
+      </w:r>
+      <w:proofErr w:type="spellEnd"/>
+      <w:r>
+        <w:t xml:space="preserve"> sensitivity across the full recall spectrum. Webs with pronounced trophic hierarchies, such as SF12, GUBP3, and Indian Lake, displayed steeper precision declines at high recall, indicating that the recovery of less obvious interactions was achieved at the cost of increased false positives. By contrast, ecosystems such as Brook Trout Lake and Ythan Estuary sustained high precision at high recall, indicating that </w:t>
+      </w:r>
+      <w:proofErr w:type="spellStart"/>
+      <w:r>
+        <w:t>generalisation</w:t>
+      </w:r>
+      <w:proofErr w:type="spellEnd"/>
+      <w:r>
+        <w:t xml:space="preserve"> remained strong when structural cohesion was present. Two testing regimes were considered. In a regime where test links were sampled randomly from </w:t>
+      </w:r>
+      <w:proofErr w:type="gramStart"/>
+      <w:r>
+        <w:t>held-out</w:t>
+      </w:r>
+      <w:proofErr w:type="gramEnd"/>
+      <w:r>
+        <w:t xml:space="preserve"> observed edges (unseen = false), higher precision was obtained as expected. In a stricter regime where test candidates were sampled from all non-observed pairs (unseen = true), performance decreased but remained within a range consistent with useful </w:t>
+      </w:r>
+      <w:proofErr w:type="spellStart"/>
+      <w:r>
+        <w:t>generalisation</w:t>
+      </w:r>
+      <w:proofErr w:type="spellEnd"/>
+      <w:r>
+        <w:t>.</w:t>
+      </w:r>
+    </w:p>
+    <w:p>
       <w:r>
         <w:rPr>
+          <w:rStyle w:val="Strong"/>
           <w:rFonts w:eastAsiaTheme="majorEastAsia"/>
-          <w:b/>
-          <w:bCs/>
         </w:rPr>
-        <w:t>Lower and more variable precision</w:t>
-      </w:r>
-      <w:r>
-        <w:t xml:space="preserve"> was observed in webs like </w:t>
-      </w:r>
+        <w:t>Species most prone to false positives.</w:t>
+      </w:r>
+    </w:p>
+    <w:p>
+      <w:r>
+        <w:t xml:space="preserve">An analysis of false-positive links by species indicated that highly generalist or taxonomically ambiguous nodes were more frequently implicated in false positives. For instance, in Twin Lake East, </w:t>
+      </w:r>
+      <w:proofErr w:type="spellStart"/>
+      <w:r>
+        <w:t>Disphania</w:t>
+      </w:r>
+      <w:proofErr w:type="spellEnd"/>
+      <w:r>
+        <w:t xml:space="preserve"> </w:t>
+      </w:r>
+      <w:proofErr w:type="spellStart"/>
+      <w:r>
+        <w:t>ambigua</w:t>
+      </w:r>
+      <w:proofErr w:type="spellEnd"/>
+      <w:r>
+        <w:t xml:space="preserve"> appeared recurrently in erroneous suggestions, and in CGP1, generalist predators such as Lota </w:t>
+      </w:r>
+      <w:proofErr w:type="spellStart"/>
+      <w:r>
+        <w:t>lota</w:t>
+      </w:r>
+      <w:proofErr w:type="spellEnd"/>
+      <w:r>
+        <w:t xml:space="preserve"> and Sander </w:t>
+      </w:r>
+      <w:proofErr w:type="spellStart"/>
+      <w:r>
+        <w:t>vitreus</w:t>
+      </w:r>
+      <w:proofErr w:type="spellEnd"/>
+      <w:r>
+        <w:t xml:space="preserve"> accounted for many false-positive interactions. In contrast, Brook Trout Lake and Indian Lake did not reveal species that were consistently prone to false positives, a finding aligned with their high overall scores. These observations indicate that overconfidence is more likely to arise around well-connected or role-ambiguous species.</w:t>
+      </w:r>
+    </w:p>
+    <w:p>
       <w:r>
         <w:rPr>
+          <w:rStyle w:val="Strong"/>
           <w:rFonts w:eastAsiaTheme="majorEastAsia"/>
-          <w:i/>
-          <w:iCs/>
         </w:rPr>
-        <w:t>CGP1</w:t>
-      </w:r>
-      <w:r>
-        <w:t xml:space="preserve"> and </w:t>
+        <w:t>Adjacency</w:t>
       </w:r>
       <w:r>
         <w:rPr>
+          <w:rStyle w:val="Strong"/>
           <w:rFonts w:eastAsiaTheme="majorEastAsia"/>
-          <w:i/>
-          <w:iCs/>
         </w:rPr>
-        <w:t>Broad Stream</w:t>
-      </w:r>
-      <w:r>
-        <w:t>, where standard deviation exceeded 0.3. This suggests the presence of highly ambiguous or noisy interactions, challenging the classifier’s confidence calibration.</w:t>
-      </w:r>
-    </w:p>
-    <w:p>
-      <w:r>
-        <w:t xml:space="preserve">These results affirm that </w:t>
+        <w:t>-</w:t>
       </w:r>
       <w:r>
         <w:rPr>
+          <w:rStyle w:val="Strong"/>
           <w:rFonts w:eastAsiaTheme="majorEastAsia"/>
-          <w:b/>
-          <w:bCs/>
         </w:rPr>
-        <w:t>ecological metadata and role-aware sampling</w:t>
-      </w:r>
-      <w:r>
-        <w:t xml:space="preserve"> reduce spurious link predictions in well-structured food webs.</w:t>
-      </w:r>
-    </w:p>
-    <w:p/>
-    <w:p>
-      <w:pPr>
-        <w:pStyle w:val="Heading2"/>
-      </w:pPr>
-      <w:r>
-        <w:t>Precision–Recall Trade-offs</w:t>
-      </w:r>
-    </w:p>
-    <w:p>
-      <w:r>
-        <w:t xml:space="preserve">Precision–recall curves highlight the model's sensitivity across the full recall spectrum. Food webs with strong trophic hierarchies, such as </w:t>
-      </w:r>
+        <w:t>predation concordance.</w:t>
+      </w:r>
+    </w:p>
+    <w:p>
+      <w:r>
+        <w:lastRenderedPageBreak/>
+        <w:t xml:space="preserve">To assess ecological realism, raw prediction matrices (adjacency) were compared with predation matrices formed by true positives from the test sets. In structurally ordered webs such as Brook Trout Lake and Indian Lake, close alignment was observed: most high-score predictions corresponded to validated predation relationships. In CGP1 and </w:t>
+      </w:r>
+      <w:proofErr w:type="spellStart"/>
+      <w:r>
+        <w:t>Dempsters</w:t>
+      </w:r>
+      <w:proofErr w:type="spellEnd"/>
+      <w:r>
+        <w:t xml:space="preserve"> Stream, larger discrepancies were noted, with numerous predicted links unsupported by test data. These discrepancies are plausibly explained by weaker trophic stratification, sparser training information, or role ambiguity (e.g., species acting as both consumers and resources). The comparison supports the use of biological constraints during training and is consistent with the benefits observed when ecology-aware negative sampling was applied.</w:t>
+      </w:r>
+    </w:p>
+    <w:p>
       <w:r>
         <w:rPr>
+          <w:rStyle w:val="Strong"/>
           <w:rFonts w:eastAsiaTheme="majorEastAsia"/>
-          <w:i/>
-          <w:iCs/>
         </w:rPr>
-        <w:t>SF12</w:t>
-      </w:r>
-      <w:r>
-        <w:t xml:space="preserve">, </w:t>
-      </w:r>
-      <w:r>
-        <w:rPr>
-          <w:rFonts w:eastAsiaTheme="majorEastAsia"/>
-          <w:i/>
-          <w:iCs/>
-        </w:rPr>
-        <w:t>GUBP3</w:t>
-      </w:r>
-      <w:r>
-        <w:t xml:space="preserve">, and </w:t>
-      </w:r>
-      <w:r>
-        <w:rPr>
-          <w:rFonts w:eastAsiaTheme="majorEastAsia"/>
-          <w:i/>
-          <w:iCs/>
-        </w:rPr>
-        <w:t>Indian Lake</w:t>
-      </w:r>
-      <w:r>
-        <w:t xml:space="preserve">, exhibited </w:t>
-      </w:r>
-      <w:r>
-        <w:rPr>
-          <w:rFonts w:eastAsiaTheme="majorEastAsia"/>
-          <w:b/>
-          <w:bCs/>
-        </w:rPr>
-        <w:t>steep precision drop-offs at high recall</w:t>
-      </w:r>
-      <w:r>
-        <w:t>, indicating difficulty in recovering less obvious interactions without increasing false positives.</w:t>
-      </w:r>
-    </w:p>
-    <w:p>
-      <w:r>
-        <w:t xml:space="preserve">Conversely, ecosystems like </w:t>
-      </w:r>
-      <w:r>
-        <w:rPr>
-          <w:rFonts w:eastAsiaTheme="majorEastAsia"/>
-          <w:i/>
-          <w:iCs/>
-        </w:rPr>
-        <w:t>Brook Trout Lake</w:t>
-      </w:r>
-      <w:r>
-        <w:t xml:space="preserve"> and </w:t>
-      </w:r>
-      <w:r>
-        <w:rPr>
-          <w:rFonts w:eastAsiaTheme="majorEastAsia"/>
-          <w:i/>
-          <w:iCs/>
-        </w:rPr>
-        <w:t>Ythan Estuary</w:t>
-      </w:r>
-      <w:r>
-        <w:t xml:space="preserve"> maintained high precision even at high recall, underscoring the model’s ability to generalize well in structurally cohesive networks.</w:t>
-      </w:r>
-    </w:p>
-    <w:p>
-      <w:r>
-        <w:t>We also compared performance under two test regimes:</w:t>
-      </w:r>
-    </w:p>
-    <w:p>
-      <w:pPr>
-        <w:pStyle w:val="ListParagraph"/>
-        <w:numPr>
-          <w:ilvl w:val="0"/>
-          <w:numId w:val="2"/>
-        </w:numPr>
-      </w:pPr>
-      <w:r>
-        <w:rPr>
-          <w:rFonts w:eastAsiaTheme="majorEastAsia"/>
-          <w:b/>
-          <w:bCs/>
-        </w:rPr>
-        <w:t>Unseen=false</w:t>
-      </w:r>
-      <w:r>
-        <w:t xml:space="preserve"> (solid lines): test links sampled randomly</w:t>
-      </w:r>
-    </w:p>
-    <w:p>
-      <w:pPr>
-        <w:pStyle w:val="ListParagraph"/>
-        <w:numPr>
-          <w:ilvl w:val="0"/>
-          <w:numId w:val="2"/>
-        </w:numPr>
-      </w:pPr>
-      <w:r>
-        <w:rPr>
-          <w:rFonts w:eastAsiaTheme="majorEastAsia"/>
-          <w:b/>
-          <w:bCs/>
-        </w:rPr>
-        <w:lastRenderedPageBreak/>
-        <w:t>Unseen=true</w:t>
-      </w:r>
-      <w:r>
-        <w:t xml:space="preserve"> (dashed lines): test links sampled among all non-observed links</w:t>
-      </w:r>
-    </w:p>
-    <w:p>
-      <w:r>
-        <w:t xml:space="preserve">The model performed better under </w:t>
-      </w:r>
-      <w:r>
-        <w:rPr>
-          <w:rFonts w:eastAsiaTheme="majorEastAsia"/>
-          <w:sz w:val="20"/>
-          <w:szCs w:val="20"/>
-        </w:rPr>
-        <w:t>unseen=false</w:t>
-      </w:r>
-      <w:r>
-        <w:t xml:space="preserve"> as </w:t>
-      </w:r>
-      <w:proofErr w:type="gramStart"/>
-      <w:r>
-        <w:t>expected, but</w:t>
-      </w:r>
-      <w:proofErr w:type="gramEnd"/>
-      <w:r>
-        <w:t xml:space="preserve"> still retained reasonable generalization under the more challenging full-unseen setup.</w:t>
-      </w:r>
-    </w:p>
-    <w:p/>
-    <w:p>
-      <w:pPr>
-        <w:pStyle w:val="Heading2"/>
-      </w:pPr>
-      <w:r>
-        <w:t>Species Most Prone to False Positives</w:t>
-      </w:r>
-    </w:p>
-    <w:p>
-      <w:r>
-        <w:t xml:space="preserve">To interpret model behavior, we analyzed </w:t>
-      </w:r>
-      <w:r>
-        <w:rPr>
-          <w:rFonts w:eastAsiaTheme="majorEastAsia"/>
-          <w:b/>
-          <w:bCs/>
-        </w:rPr>
-        <w:t>false positive links by species</w:t>
-      </w:r>
-      <w:r>
-        <w:t>. Across many networks, species with high generality (e.g., omnivores or basal resources) were overrepresented in FP predictions. For instance:</w:t>
-      </w:r>
-    </w:p>
-    <w:p>
-      <w:pPr>
-        <w:pStyle w:val="ListParagraph"/>
-        <w:numPr>
-          <w:ilvl w:val="0"/>
-          <w:numId w:val="3"/>
-        </w:numPr>
-      </w:pPr>
-      <w:r>
-        <w:t xml:space="preserve">In </w:t>
-      </w:r>
-      <w:r>
-        <w:rPr>
-          <w:rFonts w:eastAsiaTheme="majorEastAsia"/>
-          <w:i/>
-          <w:iCs/>
-        </w:rPr>
-        <w:t>Twin Lake East</w:t>
-      </w:r>
-      <w:r>
-        <w:t xml:space="preserve">, species like </w:t>
-      </w:r>
-      <w:proofErr w:type="spellStart"/>
-      <w:r>
-        <w:rPr>
-          <w:rFonts w:eastAsiaTheme="majorEastAsia"/>
-          <w:i/>
-          <w:iCs/>
-        </w:rPr>
-        <w:t>Disphania</w:t>
-      </w:r>
-      <w:proofErr w:type="spellEnd"/>
-      <w:r>
-        <w:rPr>
-          <w:rFonts w:eastAsiaTheme="majorEastAsia"/>
-          <w:i/>
-          <w:iCs/>
-        </w:rPr>
-        <w:t xml:space="preserve"> </w:t>
-      </w:r>
-      <w:proofErr w:type="spellStart"/>
-      <w:r>
-        <w:rPr>
-          <w:rFonts w:eastAsiaTheme="majorEastAsia"/>
-          <w:i/>
-          <w:iCs/>
-        </w:rPr>
-        <w:t>ambigua</w:t>
-      </w:r>
-      <w:proofErr w:type="spellEnd"/>
-      <w:r>
-        <w:t xml:space="preserve"> appeared frequently in FP links.</w:t>
-      </w:r>
-    </w:p>
-    <w:p>
-      <w:pPr>
-        <w:pStyle w:val="ListParagraph"/>
-        <w:numPr>
-          <w:ilvl w:val="0"/>
-          <w:numId w:val="3"/>
-        </w:numPr>
-      </w:pPr>
-      <w:r>
-        <w:t xml:space="preserve">In </w:t>
-      </w:r>
-      <w:r>
-        <w:rPr>
-          <w:rFonts w:eastAsiaTheme="majorEastAsia"/>
-          <w:i/>
-          <w:iCs/>
-        </w:rPr>
-        <w:t>CGP1</w:t>
-      </w:r>
-      <w:r>
-        <w:t xml:space="preserve">, generalist predators like </w:t>
-      </w:r>
-      <w:r>
-        <w:rPr>
-          <w:rFonts w:eastAsiaTheme="majorEastAsia"/>
-          <w:i/>
-          <w:iCs/>
-        </w:rPr>
-        <w:t xml:space="preserve">Lota </w:t>
-      </w:r>
-      <w:proofErr w:type="spellStart"/>
-      <w:r>
-        <w:rPr>
-          <w:rFonts w:eastAsiaTheme="majorEastAsia"/>
-          <w:i/>
-          <w:iCs/>
-        </w:rPr>
-        <w:t>lota</w:t>
-      </w:r>
-      <w:proofErr w:type="spellEnd"/>
-      <w:r>
-        <w:t xml:space="preserve"> and </w:t>
-      </w:r>
-      <w:r>
-        <w:rPr>
-          <w:rFonts w:eastAsiaTheme="majorEastAsia"/>
-          <w:i/>
-          <w:iCs/>
-        </w:rPr>
-        <w:t xml:space="preserve">Sander </w:t>
-      </w:r>
-      <w:proofErr w:type="spellStart"/>
-      <w:r>
-        <w:rPr>
-          <w:rFonts w:eastAsiaTheme="majorEastAsia"/>
-          <w:i/>
-          <w:iCs/>
-        </w:rPr>
-        <w:t>vitreus</w:t>
-      </w:r>
-      <w:proofErr w:type="spellEnd"/>
-      <w:r>
-        <w:t xml:space="preserve"> accounted for many FP interactions.</w:t>
-      </w:r>
-    </w:p>
-    <w:p>
-      <w:pPr>
-        <w:pStyle w:val="ListParagraph"/>
-        <w:numPr>
-          <w:ilvl w:val="0"/>
-          <w:numId w:val="3"/>
-        </w:numPr>
-      </w:pPr>
-      <w:r>
-        <w:t xml:space="preserve">Networks like </w:t>
-      </w:r>
-      <w:r>
-        <w:rPr>
-          <w:rFonts w:eastAsiaTheme="majorEastAsia"/>
-          <w:i/>
-          <w:iCs/>
-        </w:rPr>
-        <w:t>Brook Trout Lake</w:t>
-      </w:r>
-      <w:r>
-        <w:t xml:space="preserve"> and </w:t>
-      </w:r>
-      <w:r>
-        <w:rPr>
-          <w:rFonts w:eastAsiaTheme="majorEastAsia"/>
-          <w:i/>
-          <w:iCs/>
-        </w:rPr>
-        <w:t>Indian Lake</w:t>
-      </w:r>
-      <w:r>
-        <w:t xml:space="preserve"> showed </w:t>
-      </w:r>
-      <w:r>
-        <w:rPr>
-          <w:rFonts w:eastAsiaTheme="majorEastAsia"/>
-          <w:b/>
-          <w:bCs/>
-        </w:rPr>
-        <w:t>no significant FP-prone nodes</w:t>
-      </w:r>
-      <w:r>
-        <w:t>, aligning with their high overall performance.</w:t>
-      </w:r>
-    </w:p>
-    <w:p>
-      <w:r>
-        <w:t xml:space="preserve">This analysis suggests that </w:t>
-      </w:r>
-      <w:r>
-        <w:rPr>
-          <w:rFonts w:eastAsiaTheme="majorEastAsia"/>
-          <w:b/>
-          <w:bCs/>
-        </w:rPr>
-        <w:t>model overconfidence</w:t>
-      </w:r>
-      <w:r>
-        <w:t xml:space="preserve"> in well-connected or taxonomically ambiguous species may inflate FP rates, despite strong global metrics.</w:t>
-      </w:r>
-    </w:p>
-    <w:p/>
-    <w:p>
-      <w:pPr>
-        <w:pStyle w:val="Heading2"/>
-      </w:pPr>
-      <w:r>
-        <w:t>Structural Discrepancies: Adjacency vs Predation Matrices</w:t>
-      </w:r>
-    </w:p>
-    <w:p>
-      <w:r>
-        <w:t xml:space="preserve">To assess the alignment between inferred links and ecological realism, we compared each food web’s </w:t>
-      </w:r>
-      <w:r>
-        <w:rPr>
-          <w:rFonts w:eastAsiaTheme="majorEastAsia"/>
-          <w:b/>
-          <w:bCs/>
-        </w:rPr>
-        <w:t>adjacency matrix</w:t>
-      </w:r>
-      <w:r>
-        <w:t xml:space="preserve"> (raw predicted links) with its </w:t>
-      </w:r>
-      <w:r>
-        <w:rPr>
-          <w:rFonts w:eastAsiaTheme="majorEastAsia"/>
-          <w:b/>
-          <w:bCs/>
-        </w:rPr>
-        <w:t>predation matrix</w:t>
-      </w:r>
-      <w:r>
-        <w:t xml:space="preserve"> (TP links recovered from the test set).</w:t>
-      </w:r>
-    </w:p>
-    <w:p>
-      <w:r>
-        <w:t>Figure 5 displays these pairwise comparisons, highlighting how many of the model’s predictions correspond to biologically validated interactions:</w:t>
-      </w:r>
-    </w:p>
-    <w:p>
-      <w:pPr>
-        <w:pStyle w:val="ListParagraph"/>
-        <w:numPr>
-          <w:ilvl w:val="0"/>
-          <w:numId w:val="5"/>
-        </w:numPr>
-      </w:pPr>
-      <w:r>
-        <w:t xml:space="preserve">In structured webs like </w:t>
-      </w:r>
-      <w:r>
-        <w:rPr>
-          <w:rFonts w:eastAsiaTheme="majorEastAsia"/>
-          <w:i/>
-          <w:iCs/>
-        </w:rPr>
-        <w:t>Brook Trout Lake</w:t>
-      </w:r>
-      <w:r>
-        <w:t xml:space="preserve"> or </w:t>
-      </w:r>
-      <w:r>
-        <w:rPr>
-          <w:rFonts w:eastAsiaTheme="majorEastAsia"/>
-          <w:i/>
-          <w:iCs/>
-        </w:rPr>
-        <w:t>Indian Lake</w:t>
-      </w:r>
-      <w:r>
-        <w:t>, the adjacency matrix aligns tightly with the TP matrix</w:t>
-      </w:r>
-      <w:r>
-        <w:t>,</w:t>
-      </w:r>
-      <w:r>
-        <w:t xml:space="preserve"> most predicted links matched actual predation relationships.</w:t>
-      </w:r>
-    </w:p>
-    <w:p>
-      <w:pPr>
-        <w:pStyle w:val="ListParagraph"/>
-        <w:numPr>
-          <w:ilvl w:val="0"/>
-          <w:numId w:val="5"/>
-        </w:numPr>
-      </w:pPr>
-      <w:r>
-        <w:lastRenderedPageBreak/>
-        <w:t xml:space="preserve">In contrast, food webs like </w:t>
-      </w:r>
-      <w:r>
-        <w:rPr>
-          <w:rFonts w:eastAsiaTheme="majorEastAsia"/>
-          <w:i/>
-          <w:iCs/>
-        </w:rPr>
-        <w:t>CGP1</w:t>
-      </w:r>
-      <w:r>
-        <w:t xml:space="preserve"> or </w:t>
-      </w:r>
-      <w:proofErr w:type="spellStart"/>
-      <w:r>
-        <w:rPr>
-          <w:rFonts w:eastAsiaTheme="majorEastAsia"/>
-          <w:i/>
-          <w:iCs/>
-        </w:rPr>
-        <w:t>Dempsters</w:t>
-      </w:r>
-      <w:proofErr w:type="spellEnd"/>
-      <w:r>
-        <w:rPr>
-          <w:rFonts w:eastAsiaTheme="majorEastAsia"/>
-          <w:i/>
-          <w:iCs/>
-        </w:rPr>
-        <w:t xml:space="preserve"> Stream</w:t>
-      </w:r>
-      <w:r>
-        <w:t xml:space="preserve"> exhibit a </w:t>
-      </w:r>
-      <w:r>
-        <w:rPr>
-          <w:rFonts w:eastAsiaTheme="majorEastAsia"/>
-          <w:b/>
-          <w:bCs/>
-        </w:rPr>
-        <w:t>larger set of false positives</w:t>
-      </w:r>
-      <w:r>
-        <w:t>, where adjacency matrices contain additional links not supported by test data. This may be due to:</w:t>
-      </w:r>
-    </w:p>
-    <w:p>
-      <w:pPr>
-        <w:pStyle w:val="ListParagraph"/>
-        <w:numPr>
-          <w:ilvl w:val="1"/>
-          <w:numId w:val="5"/>
-        </w:numPr>
-      </w:pPr>
-      <w:r>
-        <w:t>Weak trophic stratification</w:t>
-      </w:r>
-    </w:p>
-    <w:p>
-      <w:pPr>
-        <w:pStyle w:val="ListParagraph"/>
-        <w:numPr>
-          <w:ilvl w:val="1"/>
-          <w:numId w:val="5"/>
-        </w:numPr>
-      </w:pPr>
-      <w:r>
-        <w:t>Sparse training data</w:t>
-      </w:r>
-    </w:p>
-    <w:p>
-      <w:pPr>
-        <w:pStyle w:val="ListParagraph"/>
-        <w:numPr>
-          <w:ilvl w:val="1"/>
-          <w:numId w:val="5"/>
-        </w:numPr>
-      </w:pPr>
-      <w:r>
-        <w:t>Role ambiguity (e.g., species with dual consumer/resource roles)</w:t>
-      </w:r>
-    </w:p>
-    <w:p>
-      <w:r>
-        <w:t xml:space="preserve">This analysis underscores the need to incorporate </w:t>
-      </w:r>
-      <w:r>
-        <w:rPr>
-          <w:rFonts w:eastAsiaTheme="majorEastAsia"/>
-          <w:b/>
-          <w:bCs/>
-        </w:rPr>
-        <w:t>biological constraints during training</w:t>
-      </w:r>
-      <w:r>
-        <w:t xml:space="preserve"> and supports our approach of using </w:t>
-      </w:r>
-      <w:r>
-        <w:rPr>
-          <w:rFonts w:eastAsiaTheme="majorEastAsia"/>
-          <w:b/>
-          <w:bCs/>
-        </w:rPr>
-        <w:t>role-filtered negative sampling</w:t>
-      </w:r>
-      <w:r>
-        <w:t>.</w:t>
+        <w:t>Comparisons with the original WLNM.</w:t>
+      </w:r>
+    </w:p>
+    <w:p>
+      <w:r>
+        <w:t xml:space="preserve">When contrasted with the original undirected WLNM using random negatives, the directed formulation and the ecology-aware negative strategy each produced improvements that were most pronounced in webs exhibiting strong directionality and clearer trophic structure. The combination of directed encoding with ecology-aware negatives yielded the most consistent gains across ecosystems, whereas benefits were smaller or mixed in webs with limited stratification or extreme sparsity. The training-ratio sweep further indicated that the directed-plus-ecology variant was less sensitive to data reduction, maintaining competitive AUC and </w:t>
+      </w:r>
+      <w:proofErr w:type="spellStart"/>
+      <w:r>
+        <w:t>favourable</w:t>
+      </w:r>
+      <w:proofErr w:type="spellEnd"/>
+      <w:r>
+        <w:t xml:space="preserve"> precision</w:t>
+      </w:r>
+      <w:r>
+        <w:t>-</w:t>
+      </w:r>
+      <w:r>
+        <w:t xml:space="preserve">recall </w:t>
+      </w:r>
+      <w:proofErr w:type="spellStart"/>
+      <w:r>
+        <w:t>behaviour</w:t>
+      </w:r>
+      <w:proofErr w:type="spellEnd"/>
+      <w:r>
+        <w:t xml:space="preserve"> down to intermediate training fractions. Removal of very small networks increased between-web comparability and reduced variance in all variants, but the relative ordering of methods was preserved, which suggests that the observed advantages are not an artefact of network size. Emphasis on rare links via the master-web procedure improved recall on scarce interactions with a moderate precision cost that depended on ecosystem type; this </w:t>
+      </w:r>
+      <w:proofErr w:type="spellStart"/>
+      <w:r>
+        <w:t>behaviour</w:t>
+      </w:r>
+      <w:proofErr w:type="spellEnd"/>
+      <w:r>
+        <w:t xml:space="preserve"> is consistent with a controlled exploration</w:t>
+      </w:r>
+      <w:r>
+        <w:t>-</w:t>
+      </w:r>
+      <w:r>
+        <w:t xml:space="preserve">exploitation trade-off. Finally, in the backbone-aware setting, performance remained strong on backbone-filtered graphs and, in several webs, improved when predictions were extended from backbone structure to non-backbone links, indicating that the learned patterns </w:t>
+      </w:r>
+      <w:proofErr w:type="spellStart"/>
+      <w:r>
+        <w:t>generalised</w:t>
+      </w:r>
+      <w:proofErr w:type="spellEnd"/>
+      <w:r>
+        <w:t xml:space="preserve"> beyond the densest substructures.</w:t>
+      </w:r>
+    </w:p>
+    <w:p>
+      <w:r>
+        <w:t xml:space="preserve">Taken together, these results show that the incorporation of directionality and ecology-aware negative sampling enhances the ecological plausibility and predictive stability of WLNM on trophic networks, while preserving the strong ranking performance that </w:t>
+      </w:r>
+      <w:proofErr w:type="spellStart"/>
+      <w:r>
+        <w:t>characterises</w:t>
+      </w:r>
+      <w:proofErr w:type="spellEnd"/>
+      <w:r>
+        <w:t xml:space="preserve"> the original formulation. The auxiliary analyses on training ratio, small-network exclusion, rare-link emphasis, and backbone awareness provide convergent evidence that the proposed modifications confer advantages that persist across ecosystem types and evaluation regimes.</w:t>
       </w:r>
     </w:p>
     <w:p>
@@ -2395,7 +1891,10 @@
       </w:r>
       <w:proofErr w:type="spellEnd"/>
       <w:r>
-        <w:t xml:space="preserve">–Lehman Neural Machine (WLNM) framework is adapted to directed trophic networks so that arrow direction is respected at every step. Around each candidate pair, a </w:t>
+        <w:t>-</w:t>
+      </w:r>
+      <w:r>
+        <w:t xml:space="preserve">Lehman Neural Machine (WLNM) framework is adapted to directed trophic networks so that arrow direction is respected at every step. Around each candidate pair, a </w:t>
       </w:r>
       <w:proofErr w:type="gramStart"/>
       <w:r>
@@ -2412,20 +1911,30 @@
       </w:r>
       <w:r>
         <w:lastRenderedPageBreak/>
-        <w:t>when these violate trophic roles. This keeps the learning signal focused on plausible alternatives. Second, the train–test splits are designed to reflect the reality of sparse food webs.</w:t>
-      </w:r>
-    </w:p>
-    <w:p>
-      <w:r>
-        <w:t xml:space="preserve">The approach is evaluated across a large collection of food webs spanning lakes, marine, streams, terrestrial aboveground, and terrestrial belowground ecosystems. Performance is assessed using metrics suited to rare positives, such as ROC–AUC and Average </w:t>
-      </w:r>
-      <w:proofErr w:type="gramStart"/>
-      <w:r>
-        <w:t>Precision, and</w:t>
-      </w:r>
-      <w:proofErr w:type="gramEnd"/>
-      <w:r>
-        <w:t xml:space="preserve"> complemented with precision–recall summaries at a fixed threshold for interpretability. Across ecosystems, the directed WLNM with ecology-aware negatives and rare-link training provides consistent gains over undirected baselines and generic heuristics, while remaining simple and reproducible.</w:t>
+        <w:t>when these violate trophic roles. This keeps the learning signal focused on plausible alternatives. Second, the train</w:t>
+      </w:r>
+      <w:r>
+        <w:t>-</w:t>
+      </w:r>
+      <w:r>
+        <w:t>test splits are designed to reflect the reality of sparse food webs.</w:t>
+      </w:r>
+    </w:p>
+    <w:p>
+      <w:r>
+        <w:t>The approach is evaluated across a large collection of food webs spanning lakes, marine, streams, terrestrial aboveground, and terrestrial belowground ecosystems. Performance is assessed using metrics suited to rare positives, such as ROC</w:t>
+      </w:r>
+      <w:r>
+        <w:t>-</w:t>
+      </w:r>
+      <w:r>
+        <w:t>AUC and Average Precision, and complemented with precision</w:t>
+      </w:r>
+      <w:r>
+        <w:t>-</w:t>
+      </w:r>
+      <w:r>
+        <w:t>recall summaries at a fixed threshold for interpretability. Across ecosystems, the directed WLNM with ecology-aware negatives and rare-link training provides consistent gains over undirected baselines and generic heuristics, while remaining simple and reproducible.</w:t>
       </w:r>
     </w:p>
     <w:p>
@@ -2519,7 +2028,13 @@
       </w:r>
       <w:proofErr w:type="gramEnd"/>
       <w:r>
-        <w:t xml:space="preserve"> prediction: estimating how likely it is that a particular prey–predator pair represents a true interaction missing from the data. A candidate pair is any ordered pair without a recorded arrow from the putative prey to the putative predator. Rather than </w:t>
+        <w:t xml:space="preserve"> prediction: estimating how likely it is that a particular prey</w:t>
+      </w:r>
+      <w:r>
+        <w:t>-</w:t>
+      </w:r>
+      <w:r>
+        <w:t xml:space="preserve">predator pair represents a true interaction missing from the data. A candidate pair is any ordered pair without a recorded arrow from the putative prey to the putative predator. Rather than </w:t>
       </w:r>
       <w:proofErr w:type="spellStart"/>
       <w:r>
@@ -2576,7 +2091,10 @@
       </w:r>
       <w:proofErr w:type="spellEnd"/>
       <w:r>
-        <w:t xml:space="preserve">–Lehman Neural Machine (WLNM), adapted to trophic networks so that direction is respected throughout. The key idea is to learn directly from the local wiring pattern around each candidate pair instead of hand-picking a rule. For every pair under consideration, a </w:t>
+        <w:t>-</w:t>
+      </w:r>
+      <w:r>
+        <w:t xml:space="preserve">Lehman Neural Machine (WLNM), adapted to trophic networks so that direction is respected throughout. The key idea is to learn directly from the local wiring pattern around each candidate pair instead of hand-picking a rule. For every pair under consideration, a </w:t>
       </w:r>
       <w:proofErr w:type="gramStart"/>
       <w:r>
@@ -2678,7 +2196,10 @@
       </w:r>
       <w:proofErr w:type="spellEnd"/>
       <w:r>
-        <w:t xml:space="preserve">–Lehman (WL) procedure. All nodes start with temporary </w:t>
+        <w:t>-</w:t>
+      </w:r>
+      <w:r>
+        <w:t xml:space="preserve">Lehman (WL) procedure. All nodes start with temporary </w:t>
       </w:r>
       <w:proofErr w:type="spellStart"/>
       <w:r>
@@ -3338,7 +2859,10 @@
       </w:r>
       <w:proofErr w:type="spellEnd"/>
       <w:r>
-        <w:t xml:space="preserve">–Lehman procedure) is used, seeded by distance from the candidate pair. The two endpoints start with the smallest </w:t>
+        <w:t>-</w:t>
+      </w:r>
+      <w:r>
+        <w:t xml:space="preserve">Lehman procedure) is used, seeded by distance from the candidate pair. The two endpoints start with the smallest </w:t>
       </w:r>
       <w:proofErr w:type="spellStart"/>
       <w:r>
@@ -3628,7 +3152,13 @@
       </w:pPr>
       <w:r>
         <w:lastRenderedPageBreak/>
-        <w:t xml:space="preserve">After fitting, the network is applied to the held-out test vectors to obtain one probability score per pair, interpreted as the likelihood of an interaction given its local structure. Ranking quality is assessed with ROC–AUC computed directly from these scores. For a concrete operating point, a fixed grid of thresholds is scanned and the one that </w:t>
+        <w:t>After fitting, the network is applied to the held-out test vectors to obtain one probability score per pair, interpreted as the likelihood of an interaction given its local structure. Ranking quality is assessed with ROC</w:t>
+      </w:r>
+      <w:r>
+        <w:t>-</w:t>
+      </w:r>
+      <w:r>
+        <w:t xml:space="preserve">AUC computed directly from these scores. For a concrete operating point, a fixed grid of thresholds is scanned and the one that </w:t>
       </w:r>
       <w:proofErr w:type="spellStart"/>
       <w:r>
@@ -3661,7 +3191,13 @@
         <w:pStyle w:val="NormalWeb"/>
       </w:pPr>
       <w:r>
-        <w:t>Performance was assessed in two complementary ways: as a ranker of candidate interactions and as a binary classifier at a single operating point. The ranking view evaluates whether true feeding links tend to receive higher scores than non-links across the whole test set. This is quantified with the area under the Receiver Operating Characteristic curve (ROC–AUC) computed directly from the raw probabilities output for each test pair. An AUC of 0.5 indicates chance-level ordering, whereas values closer to 1.0 indicate that true interactions are consistently scored above sampled non-interactions. This threshold-free metric is well suited to food webs, where confirmed links are much rarer than non-links.</w:t>
+        <w:t>Performance was assessed in two complementary ways: as a ranker of candidate interactions and as a binary classifier at a single operating point. The ranking view evaluates whether true feeding links tend to receive higher scores than non-links across the whole test set. This is quantified with the area under the Receiver Operating Characteristic curve (ROC</w:t>
+      </w:r>
+      <w:r>
+        <w:t>-</w:t>
+      </w:r>
+      <w:r>
+        <w:t>AUC) computed directly from the raw probabilities output for each test pair. An AUC of 0.5 indicates chance-level ordering, whereas values closer to 1.0 indicate that true interactions are consistently scored above sampled non-interactions. This threshold-free metric is well suited to food webs, where confirmed links are much rarer than non-links.</w:t>
       </w:r>
     </w:p>
     <w:p>
@@ -3685,7 +3221,13 @@
       </w:r>
       <w:proofErr w:type="spellEnd"/>
       <w:r>
-        <w:t xml:space="preserve"> F1 on those scores is selected. This post-hoc choice does not affect training or the AUC calculation; it simply fixes one point on the precision–recall trade-off so readers can see what fraction of positive calls </w:t>
+        <w:t xml:space="preserve"> F1 on those scores is selected. This post-hoc choice does not affect training or the AUC calculation; it simply fixes one point on the precision</w:t>
+      </w:r>
+      <w:r>
+        <w:t>-</w:t>
+      </w:r>
+      <w:r>
+        <w:t xml:space="preserve">recall trade-off so readers can see what fraction of positive calls </w:t>
       </w:r>
       <w:proofErr w:type="gramStart"/>
       <w:r>
@@ -3752,7 +3294,13 @@
       </w:r>
       <w:proofErr w:type="gramEnd"/>
       <w:r>
-        <w:t xml:space="preserve">. For every experiment, a compact results file records ROC–AUC, the reporting threshold, precision, recall, F1, the </w:t>
+        <w:t>. For every experiment, a compact results file records ROC</w:t>
+      </w:r>
+      <w:r>
+        <w:t>-</w:t>
+      </w:r>
+      <w:r>
+        <w:t xml:space="preserve">AUC, the reporting threshold, precision, recall, F1, the </w:t>
       </w:r>
       <w:proofErr w:type="spellStart"/>
       <w:r>
@@ -3800,7 +3348,10 @@
       </w:r>
       <w:proofErr w:type="spellEnd"/>
       <w:r>
-        <w:t xml:space="preserve">–Lehman </w:t>
+        <w:t>-</w:t>
+      </w:r>
+      <w:r>
+        <w:t xml:space="preserve">Lehman </w:t>
       </w:r>
       <w:proofErr w:type="spellStart"/>
       <w:r>
@@ -3905,7 +3456,13 @@
         <w:pStyle w:val="NormalWeb"/>
       </w:pPr>
       <w:r>
-        <w:t xml:space="preserve">Evaluation choices also carry caveats. ROC–AUC is reported from raw scores, which is threshold-free, but for interpretability a single probability threshold is selected that </w:t>
+        <w:t>Evaluation choices also carry caveats. ROC</w:t>
+      </w:r>
+      <w:r>
+        <w:t>-</w:t>
+      </w:r>
+      <w:r>
+        <w:t xml:space="preserve">AUC is reported from raw scores, which is threshold-free, but for interpretability a single probability threshold is selected that </w:t>
       </w:r>
       <w:proofErr w:type="spellStart"/>
       <w:r>
@@ -3921,7 +3478,13 @@
       </w:r>
       <w:proofErr w:type="spellEnd"/>
       <w:r>
-        <w:t xml:space="preserve"> AUC when comparing settings. Train–test splits include an optional reachability safeguard to avoid breaking obvious </w:t>
+        <w:t xml:space="preserve"> AUC when comparing settings. Train</w:t>
+      </w:r>
+      <w:r>
+        <w:t>-</w:t>
+      </w:r>
+      <w:r>
+        <w:t xml:space="preserve">test splits include an optional reachability safeguard to avoid breaking obvious </w:t>
       </w:r>
       <w:proofErr w:type="spellStart"/>
       <w:r>
@@ -4026,7 +3589,13 @@
       </w:r>
       <w:proofErr w:type="spellEnd"/>
       <w:r>
-        <w:t xml:space="preserve"> or repeating experiments—across workers. Each worker receives a disjoint slice of pairs and returns its vectors to the main process. No shared randomness is involved at this stage, because all stochastic choices (train–test split and sampling of non-interactions) are completed before parallel work begins. Consequently, enabling or disabling </w:t>
+        <w:t xml:space="preserve"> or repeating experiments—across workers. Each worker receives a disjoint slice of pairs and returns its vectors to the main process. No shared randomness is involved at this stage, because all stochastic choices (train</w:t>
+      </w:r>
+      <w:r>
+        <w:t>-</w:t>
+      </w:r>
+      <w:r>
+        <w:t xml:space="preserve">test split and sampling of non-interactions) are completed before parallel work begins. Consequently, enabling or disabling </w:t>
       </w:r>
       <w:proofErr w:type="spellStart"/>
       <w:r>
@@ -4058,7 +3627,13 @@
         <w:pStyle w:val="NormalWeb"/>
       </w:pPr>
       <w:r>
-        <w:t xml:space="preserve">To make runs auditable, both high-level results and the low-level events that produced them are recorded. For each food web and strategy, the program appends a row to a comma-separated results file listing ROC–AUC, the chosen decision threshold, precision, recall, F1, the </w:t>
+        <w:t>To make runs auditable, both high-level results and the low-level events that produced them are recorded. For each food web and strategy, the program appends a row to a comma-separated results file listing ROC</w:t>
+      </w:r>
+      <w:r>
+        <w:t>-</w:t>
+      </w:r>
+      <w:r>
+        <w:t xml:space="preserve">AUC, the chosen decision threshold, precision, recall, F1, the </w:t>
       </w:r>
       <w:proofErr w:type="spellStart"/>
       <w:r>
@@ -4445,7 +4020,10 @@
       </w:r>
       <w:proofErr w:type="spellEnd"/>
       <w:r>
-        <w:t xml:space="preserve">–Lehman ordering anchored </w:t>
+        <w:t>-</w:t>
+      </w:r>
+      <w:r>
+        <w:t xml:space="preserve">Lehman ordering anchored </w:t>
       </w:r>
       <w:proofErr w:type="spellStart"/>
       <w:r>
@@ -4741,7 +4319,13 @@
             <w:t>13</w:t>
           </w:r>
           <w:r>
-            <w:t>(1), 23–36. https://doi.org/10.1007/s11252-009-0101-3</w:t>
+            <w:t>(1), 23</w:t>
+          </w:r>
+          <w:r>
+            <w:t>-</w:t>
+          </w:r>
+          <w:r>
+            <w:t>36. https://doi.org/10.1007/s11252-009-0101-3</w:t>
           </w:r>
         </w:p>
         <w:p>
@@ -4766,7 +4350,13 @@
             <w:t>438</w:t>
           </w:r>
           <w:r>
-            <w:t>(7066), 303–309. https://doi.org/10.1038/nature04141</w:t>
+            <w:t>(7066), 303</w:t>
+          </w:r>
+          <w:r>
+            <w:t>-</w:t>
+          </w:r>
+          <w:r>
+            <w:t>309. https://doi.org/10.1038/nature04141</w:t>
           </w:r>
         </w:p>
         <w:p>
@@ -4856,7 +4446,13 @@
             <w:t>3</w:t>
           </w:r>
           <w:r>
-            <w:t>(6), 919–927. https://doi.org/10.1038/s41559-019-0899-x</w:t>
+            <w:t>(6), 919</w:t>
+          </w:r>
+          <w:r>
+            <w:t>-</w:t>
+          </w:r>
+          <w:r>
+            <w:t>927. https://doi.org/10.1038/s41559-019-0899-x</w:t>
           </w:r>
         </w:p>
         <w:p>
@@ -4881,7 +4477,13 @@
             <w:t>339</w:t>
           </w:r>
           <w:r>
-            <w:t>(6127), 1611–1615. https://doi.org/10.1126/science.1232728</w:t>
+            <w:t>(6127), 1611</w:t>
+          </w:r>
+          <w:r>
+            <w:t>-</w:t>
+          </w:r>
+          <w:r>
+            <w:t>1615. https://doi.org/10.1126/science.1232728</w:t>
           </w:r>
         </w:p>
         <w:p>
@@ -4994,15 +4596,7 @@
           </w:r>
           <w:proofErr w:type="spellEnd"/>
           <w:r>
-            <w:t xml:space="preserve"> </w:t>
-          </w:r>
-          <w:proofErr w:type="spellStart"/>
-          <w:r>
-            <w:t>della</w:t>
-          </w:r>
-          <w:proofErr w:type="spellEnd"/>
-          <w:r>
-            <w:t xml:space="preserve"> </w:t>
+            <w:t xml:space="preserve"> della </w:t>
           </w:r>
           <w:proofErr w:type="spellStart"/>
           <w:r>
@@ -5100,7 +4694,13 @@
             <w:t>30</w:t>
           </w:r>
           <w:r>
-            <w:t>(2), 67–72.</w:t>
+            <w:t>(2), 67</w:t>
+          </w:r>
+          <w:r>
+            <w:t>-</w:t>
+          </w:r>
+          <w:r>
+            <w:t>72.</w:t>
           </w:r>
         </w:p>
         <w:p>
@@ -5151,12 +4751,24 @@
             <w:t>97</w:t>
           </w:r>
           <w:r>
-            <w:t>(3), 228–282. https://doi.org/10.1002/bes2.1242</w:t>
+            <w:t>(3), 228</w:t>
+          </w:r>
+          <w:r>
+            <w:t>-</w:t>
+          </w:r>
+          <w:r>
+            <w:t>282. https://doi.org/10.1002/bes2.1242</w:t>
           </w:r>
         </w:p>
         <w:p>
           <w:r>
-            <w:t xml:space="preserve">Forup, M. L., Henson, K. S. E., Craze, P. G., &amp; Memmott, J. (2008). The restoration of ecological interactions: plant–pollinator networks on ancient and restored heathlands. </w:t>
+            <w:t>Forup, M. L., Henson, K. S. E., Craze, P. G., &amp; Memmott, J. (2008). The restoration of ecological interactions: plant</w:t>
+          </w:r>
+          <w:r>
+            <w:t>-</w:t>
+          </w:r>
+          <w:r>
+            <w:t xml:space="preserve">pollinator networks on ancient and restored heathlands. </w:t>
           </w:r>
           <w:r>
             <w:rPr>
@@ -5176,7 +4788,13 @@
             <w:t>45</w:t>
           </w:r>
           <w:r>
-            <w:t>(3), 742–752. https://doi.org/10.1111/j.1365-2664.2007.01390.x</w:t>
+            <w:t>(3), 742</w:t>
+          </w:r>
+          <w:r>
+            <w:t>-</w:t>
+          </w:r>
+          <w:r>
+            <w:t>752. https://doi.org/10.1111/j.1365-2664.2007.01390.x</w:t>
           </w:r>
         </w:p>
         <w:p>
@@ -5215,7 +4833,13 @@
             <w:t>Biomonitoring of Human Impacts in Freshwater Ecosystems</w:t>
           </w:r>
           <w:r>
-            <w:t xml:space="preserve"> (pp. 1–68). https://doi.org/10.1016/B978-0-12-374794-5.00001-8</w:t>
+            <w:t xml:space="preserve"> (pp. 1</w:t>
+          </w:r>
+          <w:r>
+            <w:t>-</w:t>
+          </w:r>
+          <w:r>
+            <w:t>68). https://doi.org/10.1016/B978-0-12-374794-5.00001-8</w:t>
           </w:r>
         </w:p>
         <w:p>
@@ -5289,7 +4913,13 @@
             <w:t>51</w:t>
           </w:r>
           <w:r>
-            <w:t>(5), 1444–1449. https://doi.org/10.1111/1365-2664.12300</w:t>
+            <w:t>(5), 1444</w:t>
+          </w:r>
+          <w:r>
+            <w:t>-</w:t>
+          </w:r>
+          <w:r>
+            <w:t>1449. https://doi.org/10.1111/1365-2664.12300</w:t>
           </w:r>
         </w:p>
         <w:p>
@@ -5322,7 +4952,13 @@
             <w:t>2</w:t>
           </w:r>
           <w:r>
-            <w:t>(2), 117–130. https://doi.org/10.1016/j.ecocom.2004.11.006</w:t>
+            <w:t>(2), 117</w:t>
+          </w:r>
+          <w:r>
+            <w:t>-</w:t>
+          </w:r>
+          <w:r>
+            <w:t>130. https://doi.org/10.1016/j.ecocom.2004.11.006</w:t>
           </w:r>
         </w:p>
         <w:p>
@@ -5355,7 +4991,13 @@
             <w:t>14</w:t>
           </w:r>
           <w:r>
-            <w:t>(1), 7–10. https://doi.org/10.1016/j.ecolind.2011.06.032</w:t>
+            <w:t>(1), 7</w:t>
+          </w:r>
+          <w:r>
+            <w:t>-</w:t>
+          </w:r>
+          <w:r>
+            <w:t>10. https://doi.org/10.1016/j.ecolind.2011.06.032</w:t>
           </w:r>
         </w:p>
         <w:p>
@@ -5385,10 +5027,30 @@
               <w:i/>
               <w:iCs/>
             </w:rPr>
-            <w:t>59–60</w:t>
-          </w:r>
-          <w:r>
-            <w:t>, 237–252. https://doi.org/10.1016/j.dsr2.2011.09.001</w:t>
+            <w:t>59</w:t>
+          </w:r>
+          <w:r>
+            <w:rPr>
+              <w:i/>
+              <w:iCs/>
+            </w:rPr>
+            <w:t>-</w:t>
+          </w:r>
+          <w:r>
+            <w:rPr>
+              <w:i/>
+              <w:iCs/>
+            </w:rPr>
+            <w:t>60</w:t>
+          </w:r>
+          <w:r>
+            <w:t>, 237</w:t>
+          </w:r>
+          <w:r>
+            <w:t>-</w:t>
+          </w:r>
+          <w:r>
+            <w:t>252. https://doi.org/10.1016/j.dsr2.2011.09.001</w:t>
           </w:r>
         </w:p>
         <w:p>
@@ -5411,7 +5073,13 @@
             <w:t>Machine Learning for Ecology and Sustainable Natural Resource Management</w:t>
           </w:r>
           <w:r>
-            <w:t xml:space="preserve"> (pp. 27–61). Springer International Publishing. https://doi.org/10.1007/978-3-319-96978-7_2</w:t>
+            <w:t xml:space="preserve"> (pp. 27</w:t>
+          </w:r>
+          <w:r>
+            <w:t>-</w:t>
+          </w:r>
+          <w:r>
+            <w:t>61). Springer International Publishing. https://doi.org/10.1007/978-3-319-96978-7_2</w:t>
           </w:r>
         </w:p>
         <w:p>
@@ -5470,7 +5138,13 @@
             <w:t>7</w:t>
           </w:r>
           <w:r>
-            <w:t>(1), 17–25. https://doi.org/10.1007/s11355-010-0143-y</w:t>
+            <w:t>(1), 17</w:t>
+          </w:r>
+          <w:r>
+            <w:t>-</w:t>
+          </w:r>
+          <w:r>
+            <w:t>25. https://doi.org/10.1007/s11355-010-0143-y</w:t>
           </w:r>
         </w:p>
         <w:p>
@@ -5491,7 +5165,13 @@
           </w:r>
           <w:proofErr w:type="spellEnd"/>
           <w:r>
-            <w:t xml:space="preserve">, N., Brown, L., Dormann, C. F., Edwards, F., Figueroa, D., Jacob, U., Jones, J. I., Lauridsen, R. B., Ledger, M. E., Lewis, H. M., Olesen, J. M., Van Veen, F. J. F., Warren, P. H., &amp; Woodward, G. (2009). Review: Ecological networks – beyond food webs. </w:t>
+            <w:t xml:space="preserve">, N., Brown, L., Dormann, C. F., Edwards, F., Figueroa, D., Jacob, U., Jones, J. I., Lauridsen, R. B., Ledger, M. E., Lewis, H. M., Olesen, J. M., Van Veen, F. J. F., Warren, P. H., &amp; Woodward, G. (2009). Review: Ecological networks </w:t>
+          </w:r>
+          <w:r>
+            <w:t>-</w:t>
+          </w:r>
+          <w:r>
+            <w:t xml:space="preserve"> beyond food webs. </w:t>
           </w:r>
           <w:r>
             <w:rPr>
@@ -5511,7 +5191,13 @@
             <w:t>78</w:t>
           </w:r>
           <w:r>
-            <w:t>(1), 253–269. https://doi.org/10.1111/j.1365-2656.2008.01460.x</w:t>
+            <w:t>(1), 253</w:t>
+          </w:r>
+          <w:r>
+            <w:t>-</w:t>
+          </w:r>
+          <w:r>
+            <w:t>269. https://doi.org/10.1111/j.1365-2656.2008.01460.x</w:t>
           </w:r>
         </w:p>
         <w:p>
@@ -5559,7 +5245,13 @@
             <w:t>8</w:t>
           </w:r>
           <w:r>
-            <w:t>(5), 468–479. https://doi.org/10.1111/j.1461-0248.2005.00751.x</w:t>
+            <w:t>(5), 468</w:t>
+          </w:r>
+          <w:r>
+            <w:t>-</w:t>
+          </w:r>
+          <w:r>
+            <w:t>479. https://doi.org/10.1111/j.1461-0248.2005.00751.x</w:t>
           </w:r>
         </w:p>
         <w:p>
@@ -5598,7 +5290,13 @@
             <w:t xml:space="preserve"> Food Web</w:t>
           </w:r>
           <w:r>
-            <w:t xml:space="preserve"> (pp. 69–117). https://doi.org/10.1016/B978-0-12-374794-5.00002-X</w:t>
+            <w:t xml:space="preserve"> (pp. 69</w:t>
+          </w:r>
+          <w:r>
+            <w:t>-</w:t>
+          </w:r>
+          <w:r>
+            <w:t>117). https://doi.org/10.1016/B978-0-12-374794-5.00002-X</w:t>
           </w:r>
         </w:p>
         <w:p>
@@ -5641,7 +5339,13 @@
             <w:t>171</w:t>
           </w:r>
           <w:r>
-            <w:t>(2), 459–471. https://doi.org/10.1007/s00442-012-2421-x</w:t>
+            <w:t>(2), 459</w:t>
+          </w:r>
+          <w:r>
+            <w:t>-</w:t>
+          </w:r>
+          <w:r>
+            <w:t>471. https://doi.org/10.1007/s00442-012-2421-x</w:t>
           </w:r>
         </w:p>
         <w:p>
@@ -5664,7 +5368,13 @@
             <w:t>Food Web Structure and Stability in 20 Streams Across a Wide pH Gradient</w:t>
           </w:r>
           <w:r>
-            <w:t xml:space="preserve"> (pp. 265–299). https://doi.org/10.1016/B978-0-12-381363-3.00005-8</w:t>
+            <w:t xml:space="preserve"> (pp. 265</w:t>
+          </w:r>
+          <w:r>
+            <w:t>-</w:t>
+          </w:r>
+          <w:r>
+            <w:t>299). https://doi.org/10.1016/B978-0-12-381363-3.00005-8</w:t>
           </w:r>
         </w:p>
         <w:p>
@@ -5679,7 +5389,13 @@
             <w:t>Extreme Climatic Events Alter Aquatic Food Webs</w:t>
           </w:r>
           <w:r>
-            <w:t xml:space="preserve"> (pp. 343–395). https://doi.org/10.1016/B978-0-12-417199-2.00006-9</w:t>
+            <w:t xml:space="preserve"> (pp. 343</w:t>
+          </w:r>
+          <w:r>
+            <w:t>-</w:t>
+          </w:r>
+          <w:r>
+            <w:t>395). https://doi.org/10.1016/B978-0-12-417199-2.00006-9</w:t>
           </w:r>
         </w:p>
         <w:p>
@@ -5699,8 +5415,13 @@
         </w:p>
         <w:p>
           <w:r>
-            <w:lastRenderedPageBreak/>
-            <w:t xml:space="preserve">Liu, H., Niu, T., Yu, Q., Yang, L., Ma, J., &amp; Qiu, S. (2022). Evaluation of the Spatiotemporal Evolution of China’s Ecological Spatial Network Function–Structure and Its Pattern Optimization. </w:t>
+            <w:t>Liu, H., Niu, T., Yu, Q., Yang, L., Ma, J., &amp; Qiu, S. (2022). Evaluation of the Spatiotemporal Evolution of China’s Ecological Spatial Network Function</w:t>
+          </w:r>
+          <w:r>
+            <w:t>-</w:t>
+          </w:r>
+          <w:r>
+            <w:t xml:space="preserve">Structure and Its Pattern Optimization. </w:t>
           </w:r>
           <w:r>
             <w:rPr>
@@ -5725,6 +5446,7 @@
         </w:p>
         <w:p>
           <w:r>
+            <w:lastRenderedPageBreak/>
             <w:t xml:space="preserve">Malmqvist, T. (2008). Environmental rating methods: selecting indoor environmental quality (IEQ) aspects and indicators. </w:t>
           </w:r>
           <w:r>
@@ -5745,12 +5467,24 @@
             <w:t>36</w:t>
           </w:r>
           <w:r>
-            <w:t>(5), 466–485. https://doi.org/10.1080/09613210802075841</w:t>
+            <w:t>(5), 466</w:t>
+          </w:r>
+          <w:r>
+            <w:t>-</w:t>
+          </w:r>
+          <w:r>
+            <w:t>485. https://doi.org/10.1080/09613210802075841</w:t>
           </w:r>
         </w:p>
         <w:p>
           <w:r>
-            <w:t xml:space="preserve">McCann, K. S. (2000). The diversity–stability debate. </w:t>
+            <w:t>McCann, K. S. (2000). The diversity</w:t>
+          </w:r>
+          <w:r>
+            <w:t>-</w:t>
+          </w:r>
+          <w:r>
+            <w:t xml:space="preserve">stability debate. </w:t>
           </w:r>
           <w:r>
             <w:rPr>
@@ -5770,7 +5504,13 @@
             <w:t>405</w:t>
           </w:r>
           <w:r>
-            <w:t>(6783), 228–233. https://doi.org/10.1038/35012234</w:t>
+            <w:t>(6783), 228</w:t>
+          </w:r>
+          <w:r>
+            <w:t>-</w:t>
+          </w:r>
+          <w:r>
+            <w:t>233. https://doi.org/10.1038/35012234</w:t>
           </w:r>
         </w:p>
         <w:p>
@@ -5795,7 +5535,13 @@
             <w:t>442</w:t>
           </w:r>
           <w:r>
-            <w:t>(7100), 259–264. https://doi.org/10.1038/nature04927</w:t>
+            <w:t>(7100), 259</w:t>
+          </w:r>
+          <w:r>
+            <w:t>-</w:t>
+          </w:r>
+          <w:r>
+            <w:t>264. https://doi.org/10.1038/nature04927</w:t>
           </w:r>
         </w:p>
         <w:p>
@@ -5830,7 +5576,13 @@
             <w:t>9</w:t>
           </w:r>
           <w:r>
-            <w:t>, 79143–79168. https://doi.org/10.1109/ACCESS.2021.3082932</w:t>
+            <w:t>, 79143</w:t>
+          </w:r>
+          <w:r>
+            <w:t>-</w:t>
+          </w:r>
+          <w:r>
+            <w:t>79168. https://doi.org/10.1109/ACCESS.2021.3082932</w:t>
           </w:r>
         </w:p>
         <w:p>
@@ -5968,7 +5720,13 @@
             <w:t>27</w:t>
           </w:r>
           <w:r>
-            <w:t>(12), 689–697. https://doi.org/10.1016/j.tree.2012.08.005</w:t>
+            <w:t>(12), 689</w:t>
+          </w:r>
+          <w:r>
+            <w:t>-</w:t>
+          </w:r>
+          <w:r>
+            <w:t>697. https://doi.org/10.1016/j.tree.2012.08.005</w:t>
           </w:r>
         </w:p>
         <w:p>
@@ -6001,13 +5759,24 @@
             <w:t>143</w:t>
           </w:r>
           <w:r>
-            <w:t>(10), 2270–2279. https://doi.org/10.1016/j.biocon.2009.12.004</w:t>
+            <w:t>(10), 2270</w:t>
+          </w:r>
+          <w:r>
+            <w:t>-</w:t>
+          </w:r>
+          <w:r>
+            <w:t>2279. https://doi.org/10.1016/j.biocon.2009.12.004</w:t>
           </w:r>
         </w:p>
         <w:p>
           <w:r>
-            <w:lastRenderedPageBreak/>
-            <w:t xml:space="preserve">Tylianakis, J. M., Tscharntke, T., &amp; Lewis, O. T. (2007). Habitat modification alters the structure of tropical host–parasitoid food webs. </w:t>
+            <w:t>Tylianakis, J. M., Tscharntke, T., &amp; Lewis, O. T. (2007). Habitat modification alters the structure of tropical host</w:t>
+          </w:r>
+          <w:r>
+            <w:t>-</w:t>
+          </w:r>
+          <w:r>
+            <w:t xml:space="preserve">parasitoid food webs. </w:t>
           </w:r>
           <w:r>
             <w:rPr>
@@ -6027,11 +5796,18 @@
             <w:t>445</w:t>
           </w:r>
           <w:r>
-            <w:t>(7124), 202–205. https://doi.org/10.1038/nature05429</w:t>
+            <w:t>(7124), 202</w:t>
+          </w:r>
+          <w:r>
+            <w:t>-</w:t>
+          </w:r>
+          <w:r>
+            <w:t>205. https://doi.org/10.1038/nature05429</w:t>
           </w:r>
         </w:p>
         <w:p>
           <w:r>
+            <w:lastRenderedPageBreak/>
             <w:t xml:space="preserve">Webb, L., Whetton, P., &amp; Barlow, E. (2008). Climate change and winegrape quality in Australia. </w:t>
           </w:r>
           <w:r>
@@ -6052,12 +5828,30 @@
             <w:t>36</w:t>
           </w:r>
           <w:r>
-            <w:t>, 99–111. https://doi.org/10.3354/cr00740</w:t>
+            <w:t>, 99</w:t>
+          </w:r>
+          <w:r>
+            <w:t>-</w:t>
+          </w:r>
+          <w:r>
+            <w:t>111. https://doi.org/10.3354/cr00740</w:t>
           </w:r>
         </w:p>
         <w:p>
           <w:r>
-            <w:t xml:space="preserve">Zhang, L., Peng, J., Liu, Y., &amp; Wu, J. (2017). Coupling ecosystem services supply and human ecological demand to identify landscape ecological security pattern: A case study in Beijing–Tianjin–Hebei region, China. </w:t>
+            <w:t>Zhang, L., Peng, J., Liu, Y., &amp; Wu, J. (2017). Coupling ecosystem services supply and human ecological demand to identify landscape ecological security pattern: A case study in Beijing</w:t>
+          </w:r>
+          <w:r>
+            <w:t>-</w:t>
+          </w:r>
+          <w:r>
+            <w:t>Tianjin</w:t>
+          </w:r>
+          <w:r>
+            <w:t>-</w:t>
+          </w:r>
+          <w:r>
+            <w:t xml:space="preserve">Hebei region, China. </w:t>
           </w:r>
           <w:r>
             <w:rPr>
@@ -6077,7 +5871,13 @@
             <w:t>20</w:t>
           </w:r>
           <w:r>
-            <w:t>(3), 701–714. https://doi.org/10.1007/s11252-016-0629-y</w:t>
+            <w:t>(3), 701</w:t>
+          </w:r>
+          <w:r>
+            <w:t>-</w:t>
+          </w:r>
+          <w:r>
+            <w:t>714. https://doi.org/10.1007/s11252-016-0629-y</w:t>
           </w:r>
         </w:p>
         <w:p>
@@ -6110,7 +5910,13 @@
             <w:t>Part F129685</w:t>
           </w:r>
           <w:r>
-            <w:t>, 575–583. https://doi.org/10.1145/3097983.3097996</w:t>
+            <w:t>, 575</w:t>
+          </w:r>
+          <w:r>
+            <w:t>-</w:t>
+          </w:r>
+          <w:r>
+            <w:t>583. https://doi.org/10.1145/3097983.3097996</w:t>
           </w:r>
         </w:p>
         <w:p>
@@ -6175,8 +5981,8 @@
       </w:sdtContent>
     </w:sdt>
     <w:sectPr>
-      <w:footerReference w:type="even" r:id="rId26"/>
-      <w:footerReference w:type="default" r:id="rId27"/>
+      <w:footerReference w:type="even" r:id="rId23"/>
+      <w:footerReference w:type="default" r:id="rId24"/>
       <w:pgSz w:w="15840" w:h="12240" w:orient="landscape"/>
       <w:pgMar w:top="1440" w:right="1440" w:bottom="1440" w:left="1440" w:header="720" w:footer="720" w:gutter="0"/>
       <w:lnNumType w:countBy="1" w:restart="newSection"/>
@@ -10786,7 +10592,6 @@
   <w:style w:type="character" w:default="1" w:styleId="DefaultParagraphFont">
     <w:name w:val="Default Paragraph Font"/>
     <w:uiPriority w:val="1"/>
-    <w:semiHidden/>
     <w:unhideWhenUsed/>
   </w:style>
   <w:style w:type="table" w:default="1" w:styleId="TableNormal">
@@ -11276,6 +11081,21 @@
     <w:unhideWhenUsed/>
     <w:rsid w:val="00D126E0"/>
   </w:style>
+  <w:style w:type="paragraph" w:styleId="NoSpacing">
+    <w:name w:val="No Spacing"/>
+    <w:uiPriority w:val="1"/>
+    <w:qFormat/>
+    <w:rsid w:val="003E3C4D"/>
+    <w:pPr>
+      <w:spacing w:beforeAutospacing="1" w:after="0" w:afterAutospacing="1" w:line="240" w:lineRule="auto"/>
+      <w:jc w:val="both"/>
+    </w:pPr>
+    <w:rPr>
+      <w:rFonts w:ascii="Times New Roman" w:eastAsia="Times New Roman" w:hAnsi="Times New Roman" w:cs="Times New Roman"/>
+      <w:kern w:val="0"/>
+      <w14:ligatures w14:val="none"/>
+    </w:rPr>
+  </w:style>
 </w:styles>
 </file>
 
@@ -11384,7 +11204,9 @@
     <w:rsid w:val="002A05A9"/>
     <w:rsid w:val="005E48B7"/>
     <w:rsid w:val="00702A06"/>
+    <w:rsid w:val="00783B27"/>
     <w:rsid w:val="007D0F1C"/>
+    <w:rsid w:val="00A212CF"/>
     <w:rsid w:val="00B96783"/>
     <w:rsid w:val="00C63B02"/>
     <w:rsid w:val="00EA32DF"/>

</xml_diff>

<commit_message>
Week 50 - Backbone Analysis Extensions & Predictive Feature Exploration #39
</commit_message>
<xml_diff>
--- a/docs/Methodology documentation/Supplementary Documents/Supplementary Information - Description Document.docx
+++ b/docs/Methodology documentation/Supplementary Documents/Supplementary Information - Description Document.docx
@@ -95,6 +95,9 @@
     </w:p>
     <w:p>
       <w:r>
+        <w:rPr>
+          <w:noProof/>
+        </w:rPr>
         <w:drawing>
           <wp:inline distT="0" distB="0" distL="0" distR="0" wp14:anchorId="3826AAA6" wp14:editId="52233D73">
             <wp:extent cx="4100195" cy="2192512"/>
@@ -141,6 +144,9 @@
         </w:drawing>
       </w:r>
       <w:r>
+        <w:rPr>
+          <w:noProof/>
+        </w:rPr>
         <w:drawing>
           <wp:inline distT="0" distB="0" distL="0" distR="0" wp14:anchorId="2D40D5E4" wp14:editId="148F7E1A">
             <wp:extent cx="4100300" cy="2182293"/>
@@ -1356,6 +1362,9 @@
     <w:p>
       <w:pPr>
         <w:rPr>
+          <w:rStyle w:val="Strong"/>
+          <w:b w:val="0"/>
+          <w:bCs w:val="0"/>
           <w:lang w:val="en-GB"/>
         </w:rPr>
       </w:pPr>
@@ -1390,6 +1399,1473 @@
       <w:r>
         <w:t>Lehman relabeling, and transformed into feature vectors. These representations are then used to train and evaluate a machine learning classifier. The flowchart is important because it provides a clear and systematic overview of how the pipeline operates, showing where ecological constraints (e.g., body mass filtering in negative sampling) are introduced and how subgraph-level encoding leads into predictive modeling. The diagram was generated by formalizing the methodological steps into a process flow to ensure clarity and reproducibility.</w:t>
       </w:r>
+      <w:r>
+        <w:rPr>
+          <w:lang w:val="en-GB"/>
+        </w:rPr>
+        <w:br w:type="page"/>
+      </w:r>
+      <w:r>
+        <w:rPr>
+          <w:lang w:val="en-GB"/>
+        </w:rPr>
+        <w:lastRenderedPageBreak/>
+        <w:drawing>
+          <wp:inline distT="0" distB="0" distL="0" distR="0" wp14:anchorId="7C8F4051" wp14:editId="1EA34E93">
+            <wp:extent cx="6832600" cy="3022600"/>
+            <wp:effectExtent l="0" t="0" r="0" b="0"/>
+            <wp:docPr id="1535173898" name="Picture 1" descr="A graph showing the growth of food webs&#10;&#10;AI-generated content may be incorrect."/>
+            <wp:cNvGraphicFramePr>
+              <a:graphicFrameLocks xmlns:a="http://schemas.openxmlformats.org/drawingml/2006/main" noChangeAspect="1"/>
+            </wp:cNvGraphicFramePr>
+            <a:graphic xmlns:a="http://schemas.openxmlformats.org/drawingml/2006/main">
+              <a:graphicData uri="http://schemas.openxmlformats.org/drawingml/2006/picture">
+                <pic:pic xmlns:pic="http://schemas.openxmlformats.org/drawingml/2006/picture">
+                  <pic:nvPicPr>
+                    <pic:cNvPr id="1535173898" name="Picture 1" descr="A graph showing the growth of food webs&#10;&#10;AI-generated content may be incorrect."/>
+                    <pic:cNvPicPr/>
+                  </pic:nvPicPr>
+                  <pic:blipFill>
+                    <a:blip r:embed="rId23"/>
+                    <a:stretch>
+                      <a:fillRect/>
+                    </a:stretch>
+                  </pic:blipFill>
+                  <pic:spPr>
+                    <a:xfrm>
+                      <a:off x="0" y="0"/>
+                      <a:ext cx="6832600" cy="3022600"/>
+                    </a:xfrm>
+                    <a:prstGeom prst="rect">
+                      <a:avLst/>
+                    </a:prstGeom>
+                  </pic:spPr>
+                </pic:pic>
+              </a:graphicData>
+            </a:graphic>
+          </wp:inline>
+        </w:drawing>
+      </w:r>
+    </w:p>
+    <w:p>
+      <w:pPr>
+        <w:rPr>
+          <w:lang w:val="en-GB"/>
+        </w:rPr>
+      </w:pPr>
+      <w:r>
+        <w:rPr>
+          <w:rStyle w:val="Strong"/>
+        </w:rPr>
+        <w:t>Figure 1</w:t>
+      </w:r>
+      <w:r>
+        <w:rPr>
+          <w:rStyle w:val="Strong"/>
+        </w:rPr>
+        <w:t>6</w:t>
+      </w:r>
+      <w:r>
+        <w:rPr>
+          <w:rStyle w:val="Strong"/>
+        </w:rPr>
+        <w:t>.</w:t>
+      </w:r>
+      <w:r>
+        <w:rPr>
+          <w:rStyle w:val="Strong"/>
+        </w:rPr>
+        <w:t xml:space="preserve"> </w:t>
+      </w:r>
+      <w:r>
+        <w:t xml:space="preserve">This figure summarizes the composition of the 290 food webs used in the study, grouped by ecosystem type. Marine food webs constitute the largest category (134 networks, 46.2%), reflecting their strong representation in existing ecological databases. Lakes (55 networks, 19.0%) and terrestrial belowground systems (52 networks, 17.9%) form the next most common groups, while streams (28 networks, 9.7%) and terrestrial aboveground webs (21 networks, 7.2%) are comparatively less represented. The cumulative line chart highlights how quickly marine and freshwater systems dominate the dataset, with more than 80% of all food webs belonging to the first three ecosystem types. This distribution is relevant for interpreting backbone proportions and predictive model behavior, as ecosystem structure and sampling intensity can influence network size, </w:t>
+      </w:r>
+      <w:proofErr w:type="spellStart"/>
+      <w:r>
+        <w:t>connectance</w:t>
+      </w:r>
+      <w:proofErr w:type="spellEnd"/>
+      <w:r>
+        <w:t>, and the prevalence of backbone vs. non-backbone interactions.</w:t>
+      </w:r>
+    </w:p>
+    <w:p>
+      <w:pPr>
+        <w:spacing w:beforeAutospacing="0" w:after="160" w:afterAutospacing="0" w:line="278" w:lineRule="auto"/>
+        <w:jc w:val="left"/>
+        <w:rPr>
+          <w:lang w:val="en-GB"/>
+        </w:rPr>
+      </w:pPr>
+      <w:r>
+        <w:rPr>
+          <w:lang w:val="en-GB"/>
+        </w:rPr>
+        <w:br w:type="page"/>
+      </w:r>
+    </w:p>
+    <w:p>
+      <w:pPr>
+        <w:spacing w:beforeAutospacing="0" w:after="160" w:afterAutospacing="0" w:line="278" w:lineRule="auto"/>
+        <w:jc w:val="left"/>
+        <w:rPr>
+          <w:lang w:val="en-GB"/>
+        </w:rPr>
+      </w:pPr>
+      <w:r>
+        <w:rPr>
+          <w:rStyle w:val="Strong"/>
+        </w:rPr>
+        <w:lastRenderedPageBreak/>
+        <w:drawing>
+          <wp:inline distT="0" distB="0" distL="0" distR="0" wp14:anchorId="18FE0651" wp14:editId="64451F33">
+            <wp:extent cx="7556500" cy="3136900"/>
+            <wp:effectExtent l="0" t="0" r="0" b="0"/>
+            <wp:docPr id="743910258" name="Picture 1" descr="A screenshot of a graph&#10;&#10;AI-generated content may be incorrect."/>
+            <wp:cNvGraphicFramePr>
+              <a:graphicFrameLocks xmlns:a="http://schemas.openxmlformats.org/drawingml/2006/main" noChangeAspect="1"/>
+            </wp:cNvGraphicFramePr>
+            <a:graphic xmlns:a="http://schemas.openxmlformats.org/drawingml/2006/main">
+              <a:graphicData uri="http://schemas.openxmlformats.org/drawingml/2006/picture">
+                <pic:pic xmlns:pic="http://schemas.openxmlformats.org/drawingml/2006/picture">
+                  <pic:nvPicPr>
+                    <pic:cNvPr id="743910258" name="Picture 1" descr="A screenshot of a graph&#10;&#10;AI-generated content may be incorrect."/>
+                    <pic:cNvPicPr/>
+                  </pic:nvPicPr>
+                  <pic:blipFill>
+                    <a:blip r:embed="rId24"/>
+                    <a:stretch>
+                      <a:fillRect/>
+                    </a:stretch>
+                  </pic:blipFill>
+                  <pic:spPr>
+                    <a:xfrm>
+                      <a:off x="0" y="0"/>
+                      <a:ext cx="7556500" cy="3136900"/>
+                    </a:xfrm>
+                    <a:prstGeom prst="rect">
+                      <a:avLst/>
+                    </a:prstGeom>
+                  </pic:spPr>
+                </pic:pic>
+              </a:graphicData>
+            </a:graphic>
+          </wp:inline>
+        </w:drawing>
+      </w:r>
+    </w:p>
+    <w:p>
+      <w:pPr>
+        <w:pStyle w:val="NormalWeb"/>
+      </w:pPr>
+      <w:r>
+        <w:rPr>
+          <w:rStyle w:val="Strong"/>
+        </w:rPr>
+        <w:t>Figure 1</w:t>
+      </w:r>
+      <w:r>
+        <w:rPr>
+          <w:rStyle w:val="Strong"/>
+        </w:rPr>
+        <w:t>7</w:t>
+      </w:r>
+      <w:r>
+        <w:rPr>
+          <w:rStyle w:val="Strong"/>
+        </w:rPr>
+        <w:t>.</w:t>
+      </w:r>
+      <w:r>
+        <w:rPr>
+          <w:rStyle w:val="Strong"/>
+        </w:rPr>
+        <w:t xml:space="preserve"> </w:t>
+      </w:r>
+      <w:r>
+        <w:t>This figure compares the predictive performance of WLNM across 157 food webs with more than 40 nodes, contrasting the baseline model (no backbone filtering) with three backbone regimes (BR = 20%, 50%, 80%) at a fixed train ratio of 60%. Each panel shows the distribution of AUC, Precision, Recall, and F1-Score across networks, illustrating both central tendencies and variability induced by different backbone proportions.</w:t>
+      </w:r>
+    </w:p>
+    <w:p>
+      <w:pPr>
+        <w:spacing w:before="100"/>
+      </w:pPr>
+      <w:r>
+        <w:t xml:space="preserve">The baseline condition (panel a) shows relatively tight performance ranges, serving as a reference for backbone-filtered </w:t>
+      </w:r>
+      <w:proofErr w:type="spellStart"/>
+      <w:r>
+        <w:t>behaviours</w:t>
+      </w:r>
+      <w:proofErr w:type="spellEnd"/>
+      <w:r>
+        <w:t>. Introducing backbone filtering (panels b–d) increases the dispersion of all metrics, particularly Recall and F1-Score, indicating that the composition of the training graph influences how effectively WLNM captures rare or structurally constrained interactions. Lower backbone ratios (BR = 20%) yield performance distributions close to baseline, whereas higher backbone emphasis (BR = 50% and especially BR = 80%) tends to reduce median scores and amplify inter-food-web variability. These patterns suggest that while backbone structures encode important ecological signals, excessive pruning disrupts the subgraph context required by WLNM, particularly in networks with uneven trophic architecture.</w:t>
+      </w:r>
+    </w:p>
+    <w:p>
+      <w:pPr>
+        <w:spacing w:beforeAutospacing="0" w:after="160" w:afterAutospacing="0" w:line="278" w:lineRule="auto"/>
+        <w:jc w:val="left"/>
+        <w:rPr>
+          <w:lang w:val="en-GB"/>
+        </w:rPr>
+      </w:pPr>
+      <w:r>
+        <w:rPr>
+          <w:lang w:val="en-GB"/>
+        </w:rPr>
+        <w:br w:type="page"/>
+      </w:r>
+    </w:p>
+    <w:p>
+      <w:pPr>
+        <w:spacing w:beforeAutospacing="0" w:after="160" w:afterAutospacing="0" w:line="278" w:lineRule="auto"/>
+        <w:jc w:val="left"/>
+        <w:rPr>
+          <w:lang w:val="en-GB"/>
+        </w:rPr>
+      </w:pPr>
+      <w:r>
+        <w:rPr>
+          <w:lang w:val="en-GB"/>
+        </w:rPr>
+        <w:lastRenderedPageBreak/>
+        <w:drawing>
+          <wp:inline distT="0" distB="0" distL="0" distR="0" wp14:anchorId="5469725C" wp14:editId="0C6C2457">
+            <wp:extent cx="5807676" cy="2409567"/>
+            <wp:effectExtent l="0" t="0" r="0" b="3810"/>
+            <wp:docPr id="974461896" name="Picture 1" descr="A graph of different colored bars&#10;&#10;AI-generated content may be incorrect."/>
+            <wp:cNvGraphicFramePr>
+              <a:graphicFrameLocks xmlns:a="http://schemas.openxmlformats.org/drawingml/2006/main" noChangeAspect="1"/>
+            </wp:cNvGraphicFramePr>
+            <a:graphic xmlns:a="http://schemas.openxmlformats.org/drawingml/2006/main">
+              <a:graphicData uri="http://schemas.openxmlformats.org/drawingml/2006/picture">
+                <pic:pic xmlns:pic="http://schemas.openxmlformats.org/drawingml/2006/picture">
+                  <pic:nvPicPr>
+                    <pic:cNvPr id="974461896" name="Picture 1" descr="A graph of different colored bars&#10;&#10;AI-generated content may be incorrect."/>
+                    <pic:cNvPicPr/>
+                  </pic:nvPicPr>
+                  <pic:blipFill>
+                    <a:blip r:embed="rId25"/>
+                    <a:stretch>
+                      <a:fillRect/>
+                    </a:stretch>
+                  </pic:blipFill>
+                  <pic:spPr>
+                    <a:xfrm>
+                      <a:off x="0" y="0"/>
+                      <a:ext cx="5893015" cy="2444974"/>
+                    </a:xfrm>
+                    <a:prstGeom prst="rect">
+                      <a:avLst/>
+                    </a:prstGeom>
+                  </pic:spPr>
+                </pic:pic>
+              </a:graphicData>
+            </a:graphic>
+          </wp:inline>
+        </w:drawing>
+      </w:r>
+    </w:p>
+    <w:p>
+      <w:pPr>
+        <w:spacing w:beforeAutospacing="0" w:after="160" w:afterAutospacing="0" w:line="278" w:lineRule="auto"/>
+        <w:jc w:val="left"/>
+        <w:rPr>
+          <w:lang w:val="en-GB"/>
+        </w:rPr>
+      </w:pPr>
+      <w:r>
+        <w:rPr>
+          <w:lang w:val="en-GB"/>
+        </w:rPr>
+        <w:drawing>
+          <wp:inline distT="0" distB="0" distL="0" distR="0" wp14:anchorId="4A21E577" wp14:editId="0612A7AF">
+            <wp:extent cx="5807075" cy="2409319"/>
+            <wp:effectExtent l="0" t="0" r="0" b="3810"/>
+            <wp:docPr id="437359787" name="Picture 1" descr="A graph of different colored bars&#10;&#10;AI-generated content may be incorrect."/>
+            <wp:cNvGraphicFramePr>
+              <a:graphicFrameLocks xmlns:a="http://schemas.openxmlformats.org/drawingml/2006/main" noChangeAspect="1"/>
+            </wp:cNvGraphicFramePr>
+            <a:graphic xmlns:a="http://schemas.openxmlformats.org/drawingml/2006/main">
+              <a:graphicData uri="http://schemas.openxmlformats.org/drawingml/2006/picture">
+                <pic:pic xmlns:pic="http://schemas.openxmlformats.org/drawingml/2006/picture">
+                  <pic:nvPicPr>
+                    <pic:cNvPr id="437359787" name="Picture 1" descr="A graph of different colored bars&#10;&#10;AI-generated content may be incorrect."/>
+                    <pic:cNvPicPr/>
+                  </pic:nvPicPr>
+                  <pic:blipFill>
+                    <a:blip r:embed="rId26"/>
+                    <a:stretch>
+                      <a:fillRect/>
+                    </a:stretch>
+                  </pic:blipFill>
+                  <pic:spPr>
+                    <a:xfrm>
+                      <a:off x="0" y="0"/>
+                      <a:ext cx="5908367" cy="2451344"/>
+                    </a:xfrm>
+                    <a:prstGeom prst="rect">
+                      <a:avLst/>
+                    </a:prstGeom>
+                  </pic:spPr>
+                </pic:pic>
+              </a:graphicData>
+            </a:graphic>
+          </wp:inline>
+        </w:drawing>
+      </w:r>
+    </w:p>
+    <w:p>
+      <w:pPr>
+        <w:pStyle w:val="NormalWeb"/>
+      </w:pPr>
+      <w:r>
+        <w:rPr>
+          <w:rStyle w:val="Strong"/>
+        </w:rPr>
+        <w:t>Figure 1</w:t>
+      </w:r>
+      <w:r>
+        <w:rPr>
+          <w:rStyle w:val="Strong"/>
+        </w:rPr>
+        <w:t>8</w:t>
+      </w:r>
+      <w:r>
+        <w:rPr>
+          <w:rStyle w:val="Strong"/>
+        </w:rPr>
+        <w:t>.</w:t>
+      </w:r>
+      <w:r>
+        <w:rPr>
+          <w:rStyle w:val="Strong"/>
+        </w:rPr>
+        <w:t xml:space="preserve"> </w:t>
+      </w:r>
+      <w:r>
+        <w:t>These two bar charts summarize how WLNM performance varies across different training-set compositions, using all food webs with more than 40 nodes (</w:t>
+      </w:r>
+      <w:proofErr w:type="spellStart"/>
+      <w:r>
+        <w:rPr>
+          <w:b/>
+          <w:bCs/>
+        </w:rPr>
+        <w:t>TrainRatio</w:t>
+      </w:r>
+      <w:proofErr w:type="spellEnd"/>
+      <w:r>
+        <w:rPr>
+          <w:b/>
+          <w:bCs/>
+        </w:rPr>
+        <w:t xml:space="preserve"> = 60%, n = 157</w:t>
+      </w:r>
+      <w:r>
+        <w:t xml:space="preserve">). The first panel reports metrics as a function of the </w:t>
+      </w:r>
+      <w:r>
+        <w:rPr>
+          <w:b/>
+          <w:bCs/>
+        </w:rPr>
+        <w:t>Backbone Ratio</w:t>
+      </w:r>
+      <w:r>
+        <w:t xml:space="preserve">—the percentage of statistically supported (PF-backbone) edges included in training—while the second panel presents the complementary perspective using the </w:t>
+      </w:r>
+      <w:r>
+        <w:rPr>
+          <w:b/>
+          <w:bCs/>
+        </w:rPr>
+        <w:t>Non-backbone Ratio</w:t>
+      </w:r>
+      <w:r>
+        <w:t xml:space="preserve"> (i.e., 100 − </w:t>
+      </w:r>
+      <w:proofErr w:type="spellStart"/>
+      <w:r>
+        <w:t>BackboneRatio</w:t>
+      </w:r>
+      <w:proofErr w:type="spellEnd"/>
+      <w:r>
+        <w:t>).</w:t>
+      </w:r>
+    </w:p>
+    <w:p>
+      <w:pPr>
+        <w:spacing w:before="100"/>
+        <w:jc w:val="left"/>
+      </w:pPr>
+      <w:r>
+        <w:lastRenderedPageBreak/>
+        <w:t xml:space="preserve">Across both representations, the results reveal a generally stable performance profile for the </w:t>
+      </w:r>
+      <w:proofErr w:type="gramStart"/>
+      <w:r>
+        <w:t>four evaluation</w:t>
+      </w:r>
+      <w:proofErr w:type="gramEnd"/>
+      <w:r>
+        <w:t xml:space="preserve"> metrics (AUC, Precision, Recall, F1-Score). AUC remains high (≈0.85–0.95) for all ratios, indicating that WLNM is robust to substantial shifts in backbone vs. non-backbone composition. Precision and F1-score also vary minimally, suggesting that the model can extract useful structural information even when backbone edges constitute only a portion of the training data.</w:t>
+      </w:r>
+    </w:p>
+    <w:p>
+      <w:pPr>
+        <w:spacing w:before="100"/>
+        <w:jc w:val="left"/>
+      </w:pPr>
+      <w:r>
+        <w:t xml:space="preserve">The clearest pattern emerges in </w:t>
+      </w:r>
+      <w:r>
+        <w:rPr>
+          <w:b/>
+          <w:bCs/>
+        </w:rPr>
+        <w:t>Recall</w:t>
+      </w:r>
+      <w:r>
+        <w:t>, which slightly improves around moderate backbone inclusion (≈50%) and clearly drops when the training set becomes dominated by non-backbone edges (≈80% NBR). This indicates that excessive dilution of statistically reliable edges reduces the model’s ability to recover true trophic interactions.</w:t>
+      </w:r>
+    </w:p>
+    <w:p>
+      <w:pPr>
+        <w:spacing w:before="100"/>
+        <w:jc w:val="left"/>
+      </w:pPr>
+      <w:r>
+        <w:t xml:space="preserve">Taken together, both views show that WLNM tolerates wide variation in train-set composition, but that </w:t>
+      </w:r>
+      <w:r>
+        <w:rPr>
+          <w:b/>
+          <w:bCs/>
+        </w:rPr>
+        <w:t>balanced mixtures of backbone and non-backbone edges yield the most stable and biologically interpretable performance</w:t>
+      </w:r>
+      <w:r>
+        <w:t>, while extreme non-backbone dominance leads to measurable degradation—particularly in recall.</w:t>
+      </w:r>
+    </w:p>
+    <w:p>
+      <w:pPr>
+        <w:spacing w:beforeAutospacing="0" w:after="160" w:afterAutospacing="0" w:line="278" w:lineRule="auto"/>
+        <w:jc w:val="left"/>
+        <w:rPr>
+          <w:lang w:val="en-GB"/>
+        </w:rPr>
+      </w:pPr>
+      <w:r>
+        <w:rPr>
+          <w:lang w:val="en-GB"/>
+        </w:rPr>
+        <w:br w:type="page"/>
+      </w:r>
+    </w:p>
+    <w:p>
+      <w:pPr>
+        <w:spacing w:beforeAutospacing="0" w:after="160" w:afterAutospacing="0" w:line="278" w:lineRule="auto"/>
+        <w:jc w:val="left"/>
+        <w:rPr>
+          <w:lang w:val="en-GB"/>
+        </w:rPr>
+      </w:pPr>
+      <w:r>
+        <w:rPr>
+          <w:lang w:val="en-GB"/>
+        </w:rPr>
+        <w:lastRenderedPageBreak/>
+        <w:drawing>
+          <wp:inline distT="0" distB="0" distL="0" distR="0" wp14:anchorId="36FC571D" wp14:editId="0CEE15EC">
+            <wp:extent cx="6794500" cy="2578100"/>
+            <wp:effectExtent l="0" t="0" r="0" b="0"/>
+            <wp:docPr id="1667670388" name="Picture 1" descr="A diagram of a diamond&#10;&#10;AI-generated content may be incorrect."/>
+            <wp:cNvGraphicFramePr>
+              <a:graphicFrameLocks xmlns:a="http://schemas.openxmlformats.org/drawingml/2006/main" noChangeAspect="1"/>
+            </wp:cNvGraphicFramePr>
+            <a:graphic xmlns:a="http://schemas.openxmlformats.org/drawingml/2006/main">
+              <a:graphicData uri="http://schemas.openxmlformats.org/drawingml/2006/picture">
+                <pic:pic xmlns:pic="http://schemas.openxmlformats.org/drawingml/2006/picture">
+                  <pic:nvPicPr>
+                    <pic:cNvPr id="1667670388" name="Picture 1" descr="A diagram of a diamond&#10;&#10;AI-generated content may be incorrect."/>
+                    <pic:cNvPicPr/>
+                  </pic:nvPicPr>
+                  <pic:blipFill>
+                    <a:blip r:embed="rId27"/>
+                    <a:stretch>
+                      <a:fillRect/>
+                    </a:stretch>
+                  </pic:blipFill>
+                  <pic:spPr>
+                    <a:xfrm>
+                      <a:off x="0" y="0"/>
+                      <a:ext cx="6794500" cy="2578100"/>
+                    </a:xfrm>
+                    <a:prstGeom prst="rect">
+                      <a:avLst/>
+                    </a:prstGeom>
+                  </pic:spPr>
+                </pic:pic>
+              </a:graphicData>
+            </a:graphic>
+          </wp:inline>
+        </w:drawing>
+      </w:r>
+    </w:p>
+    <w:p>
+      <w:pPr>
+        <w:spacing w:beforeAutospacing="0" w:after="160" w:afterAutospacing="0" w:line="278" w:lineRule="auto"/>
+        <w:jc w:val="left"/>
+        <w:rPr>
+          <w:lang w:val="en-GB"/>
+        </w:rPr>
+      </w:pPr>
+      <w:r>
+        <w:rPr>
+          <w:lang w:val="en-GB"/>
+        </w:rPr>
+        <w:drawing>
+          <wp:inline distT="0" distB="0" distL="0" distR="0" wp14:anchorId="16C7C34E" wp14:editId="5EE7B05E">
+            <wp:extent cx="6794500" cy="2578100"/>
+            <wp:effectExtent l="0" t="0" r="0" b="0"/>
+            <wp:docPr id="1433648992" name="Picture 1" descr="A green diamond with white text&#10;&#10;AI-generated content may be incorrect."/>
+            <wp:cNvGraphicFramePr>
+              <a:graphicFrameLocks xmlns:a="http://schemas.openxmlformats.org/drawingml/2006/main" noChangeAspect="1"/>
+            </wp:cNvGraphicFramePr>
+            <a:graphic xmlns:a="http://schemas.openxmlformats.org/drawingml/2006/main">
+              <a:graphicData uri="http://schemas.openxmlformats.org/drawingml/2006/picture">
+                <pic:pic xmlns:pic="http://schemas.openxmlformats.org/drawingml/2006/picture">
+                  <pic:nvPicPr>
+                    <pic:cNvPr id="1433648992" name="Picture 1" descr="A green diamond with white text&#10;&#10;AI-generated content may be incorrect."/>
+                    <pic:cNvPicPr/>
+                  </pic:nvPicPr>
+                  <pic:blipFill>
+                    <a:blip r:embed="rId28"/>
+                    <a:stretch>
+                      <a:fillRect/>
+                    </a:stretch>
+                  </pic:blipFill>
+                  <pic:spPr>
+                    <a:xfrm>
+                      <a:off x="0" y="0"/>
+                      <a:ext cx="6794500" cy="2578100"/>
+                    </a:xfrm>
+                    <a:prstGeom prst="rect">
+                      <a:avLst/>
+                    </a:prstGeom>
+                  </pic:spPr>
+                </pic:pic>
+              </a:graphicData>
+            </a:graphic>
+          </wp:inline>
+        </w:drawing>
+      </w:r>
+    </w:p>
+    <w:p>
+      <w:pPr>
+        <w:pStyle w:val="NormalWeb"/>
+      </w:pPr>
+      <w:r>
+        <w:rPr>
+          <w:rStyle w:val="Strong"/>
+        </w:rPr>
+        <w:t>Figure 1</w:t>
+      </w:r>
+      <w:r>
+        <w:rPr>
+          <w:rStyle w:val="Strong"/>
+        </w:rPr>
+        <w:t>9</w:t>
+      </w:r>
+      <w:r>
+        <w:rPr>
+          <w:rStyle w:val="Strong"/>
+        </w:rPr>
+        <w:t>.</w:t>
+      </w:r>
+      <w:r>
+        <w:rPr>
+          <w:rStyle w:val="Strong"/>
+        </w:rPr>
+        <w:t xml:space="preserve"> </w:t>
+      </w:r>
+      <w:r>
+        <w:t>These radar plots summarize how WLNM performance varies across four core metrics—</w:t>
+      </w:r>
+      <w:r>
+        <w:rPr>
+          <w:b/>
+          <w:bCs/>
+        </w:rPr>
+        <w:t>AUC</w:t>
+      </w:r>
+      <w:r>
+        <w:t xml:space="preserve">, </w:t>
+      </w:r>
+      <w:r>
+        <w:rPr>
+          <w:b/>
+          <w:bCs/>
+        </w:rPr>
+        <w:t>Precision</w:t>
+      </w:r>
+      <w:r>
+        <w:t xml:space="preserve">, </w:t>
+      </w:r>
+      <w:r>
+        <w:rPr>
+          <w:b/>
+          <w:bCs/>
+        </w:rPr>
+        <w:t>Recall</w:t>
+      </w:r>
+      <w:r>
+        <w:t xml:space="preserve">, and </w:t>
+      </w:r>
+      <w:r>
+        <w:rPr>
+          <w:b/>
+          <w:bCs/>
+        </w:rPr>
+        <w:t>F1Score</w:t>
+      </w:r>
+      <w:r>
+        <w:t xml:space="preserve">—for all food webs with more than 40 nodes (n = 157), under different backbone and non-backbone ratio regimes. Each subplot </w:t>
+      </w:r>
+      <w:r>
+        <w:lastRenderedPageBreak/>
+        <w:t>corresponds to a specific ratio (20%, 50%, 80% backbone, or equivalently 40%, 60%, 80% non-backbone), while the overlaid colored polygons represent the three training ratios (60%, 70%, 80%).</w:t>
+      </w:r>
+    </w:p>
+    <w:p>
+      <w:pPr>
+        <w:spacing w:before="100"/>
+      </w:pPr>
+      <w:r>
+        <w:t>Across all panels, the metric profiles remain remarkably consistent: the polygons maintain a nearly symmetric shape, indicating balanced behavior across AUC, Precision, Recall, and F1Score. As the backbone ratio increases (top row), performance shows a mild improvement, particularly in AUC and Recall, suggesting that training on a higher share of statistically supported edges slightly enhances predictive stability. Conversely, when the training set is increasingly dominated by non-backbone edges (bottom row), the polygons flatten subtly for some metrics—especially Precision—highlighting the reduced structural information contained in weaker or less confident interactions.</w:t>
+      </w:r>
+    </w:p>
+    <w:p>
+      <w:pPr>
+        <w:spacing w:before="100"/>
+      </w:pPr>
+      <w:r>
+        <w:t xml:space="preserve">Yet, even under extreme configurations (80% backbone or 80% non-backbone), the three training ratios produce overlapping profiles, underscoring the </w:t>
+      </w:r>
+      <w:r>
+        <w:rPr>
+          <w:b/>
+          <w:bCs/>
+        </w:rPr>
+        <w:t>robustness</w:t>
+      </w:r>
+      <w:r>
+        <w:t xml:space="preserve"> of WLNM: the model maintains high and stable values across all metrics regardless of how backbone and non-backbone edges are proportioned. Overall, these radar plots show that while the backbone composition of the training set influences prediction slightly, particularly at the extremes, WLNM retains a consistently strong and well-balanced performance across a wide range of sampling regimes.</w:t>
+      </w:r>
+    </w:p>
+    <w:p>
+      <w:pPr>
+        <w:spacing w:beforeAutospacing="0" w:after="160" w:afterAutospacing="0" w:line="278" w:lineRule="auto"/>
+        <w:jc w:val="left"/>
+        <w:rPr>
+          <w:lang w:val="en-GB"/>
+        </w:rPr>
+      </w:pPr>
+      <w:r>
+        <w:rPr>
+          <w:lang w:val="en-GB"/>
+        </w:rPr>
+        <w:br w:type="page"/>
+      </w:r>
+    </w:p>
+    <w:p>
+      <w:pPr>
+        <w:spacing w:beforeAutospacing="0" w:after="160" w:afterAutospacing="0" w:line="278" w:lineRule="auto"/>
+        <w:jc w:val="left"/>
+        <w:rPr>
+          <w:lang w:val="en-GB"/>
+        </w:rPr>
+      </w:pPr>
+      <w:r>
+        <w:rPr>
+          <w:lang w:val="en-GB"/>
+        </w:rPr>
+        <w:lastRenderedPageBreak/>
+        <w:drawing>
+          <wp:inline distT="0" distB="0" distL="0" distR="0" wp14:anchorId="198EF363" wp14:editId="1EB8B86A">
+            <wp:extent cx="8229600" cy="2285365"/>
+            <wp:effectExtent l="0" t="0" r="0" b="635"/>
+            <wp:docPr id="989066878" name="Picture 1" descr="A graph of different colored squares&#10;&#10;AI-generated content may be incorrect."/>
+            <wp:cNvGraphicFramePr>
+              <a:graphicFrameLocks xmlns:a="http://schemas.openxmlformats.org/drawingml/2006/main" noChangeAspect="1"/>
+            </wp:cNvGraphicFramePr>
+            <a:graphic xmlns:a="http://schemas.openxmlformats.org/drawingml/2006/main">
+              <a:graphicData uri="http://schemas.openxmlformats.org/drawingml/2006/picture">
+                <pic:pic xmlns:pic="http://schemas.openxmlformats.org/drawingml/2006/picture">
+                  <pic:nvPicPr>
+                    <pic:cNvPr id="989066878" name="Picture 1" descr="A graph of different colored squares&#10;&#10;AI-generated content may be incorrect."/>
+                    <pic:cNvPicPr/>
+                  </pic:nvPicPr>
+                  <pic:blipFill>
+                    <a:blip r:embed="rId29"/>
+                    <a:stretch>
+                      <a:fillRect/>
+                    </a:stretch>
+                  </pic:blipFill>
+                  <pic:spPr>
+                    <a:xfrm>
+                      <a:off x="0" y="0"/>
+                      <a:ext cx="8229600" cy="2285365"/>
+                    </a:xfrm>
+                    <a:prstGeom prst="rect">
+                      <a:avLst/>
+                    </a:prstGeom>
+                  </pic:spPr>
+                </pic:pic>
+              </a:graphicData>
+            </a:graphic>
+          </wp:inline>
+        </w:drawing>
+      </w:r>
+    </w:p>
+    <w:p>
+      <w:pPr>
+        <w:pStyle w:val="NormalWeb"/>
+      </w:pPr>
+      <w:r>
+        <w:rPr>
+          <w:rStyle w:val="Strong"/>
+        </w:rPr>
+        <w:t xml:space="preserve">Figure </w:t>
+      </w:r>
+      <w:r>
+        <w:rPr>
+          <w:rStyle w:val="Strong"/>
+        </w:rPr>
+        <w:t>20</w:t>
+      </w:r>
+      <w:r>
+        <w:rPr>
+          <w:rStyle w:val="Strong"/>
+        </w:rPr>
+        <w:t>.</w:t>
+      </w:r>
+      <w:r>
+        <w:rPr>
+          <w:rStyle w:val="Strong"/>
+        </w:rPr>
+        <w:t xml:space="preserve"> </w:t>
+      </w:r>
+      <w:r>
+        <w:t xml:space="preserve">This figure presents a set of four 3D </w:t>
+      </w:r>
+      <w:proofErr w:type="spellStart"/>
+      <w:r>
+        <w:t>barplots</w:t>
+      </w:r>
+      <w:proofErr w:type="spellEnd"/>
+      <w:r>
+        <w:t xml:space="preserve"> summarizing how WLNM performance varies across combinations of </w:t>
+      </w:r>
+      <w:proofErr w:type="spellStart"/>
+      <w:r>
+        <w:rPr>
+          <w:b/>
+          <w:bCs/>
+        </w:rPr>
+        <w:t>TrainRatio</w:t>
+      </w:r>
+      <w:proofErr w:type="spellEnd"/>
+      <w:r>
+        <w:t xml:space="preserve"> (60%, 70%, 80%) and </w:t>
+      </w:r>
+      <w:proofErr w:type="spellStart"/>
+      <w:r>
+        <w:rPr>
+          <w:b/>
+          <w:bCs/>
+        </w:rPr>
+        <w:t>BackboneRatio</w:t>
+      </w:r>
+      <w:proofErr w:type="spellEnd"/>
+      <w:r>
+        <w:t xml:space="preserve"> (20%, 50%, 80%) for all food webs with more than 40 nodes (</w:t>
+      </w:r>
+      <w:r>
+        <w:rPr>
+          <w:b/>
+          <w:bCs/>
+        </w:rPr>
+        <w:t>n = 157</w:t>
+      </w:r>
+      <w:r>
+        <w:t xml:space="preserve">). Each panel corresponds to one evaluation metric: </w:t>
+      </w:r>
+      <w:r>
+        <w:rPr>
+          <w:b/>
+          <w:bCs/>
+        </w:rPr>
+        <w:t>(a)</w:t>
+      </w:r>
+      <w:r>
+        <w:t xml:space="preserve"> AUC, </w:t>
+      </w:r>
+      <w:r>
+        <w:rPr>
+          <w:b/>
+          <w:bCs/>
+        </w:rPr>
+        <w:t>(b)</w:t>
+      </w:r>
+      <w:r>
+        <w:t xml:space="preserve"> Precision, </w:t>
+      </w:r>
+      <w:r>
+        <w:rPr>
+          <w:b/>
+          <w:bCs/>
+        </w:rPr>
+        <w:t>(c)</w:t>
+      </w:r>
+      <w:r>
+        <w:t xml:space="preserve"> Recall, and </w:t>
+      </w:r>
+      <w:r>
+        <w:rPr>
+          <w:b/>
+          <w:bCs/>
+        </w:rPr>
+        <w:t>(d)</w:t>
+      </w:r>
+      <w:r>
+        <w:t xml:space="preserve"> F1-Score. The height of each bar represents the mean metric value across food webs, while the color scale provides an additional visual cue about performance magnitude.</w:t>
+      </w:r>
+    </w:p>
+    <w:p>
+      <w:pPr>
+        <w:spacing w:before="100"/>
+      </w:pPr>
+      <w:r>
+        <w:t xml:space="preserve">Overall, the model shows </w:t>
+      </w:r>
+      <w:r>
+        <w:rPr>
+          <w:b/>
+          <w:bCs/>
+        </w:rPr>
+        <w:t>strong and consistent accuracy</w:t>
+      </w:r>
+      <w:r>
+        <w:t>, with AUC values remaining high (≈0.85–0.95) across all configurations. Precision and F1-Score exhibit relatively modest variation, suggesting that WLNM can effectively learn discriminative subgraph patterns even under different backbone compositions. Recall displays a clearer dependency on the ratio of backbone to non-backbone edges: moderate backbone inclusion (≈50%) generally yields the most balanced recall, whereas extreme backbone ratios—either very low or very high—tend to reduce the model’s ability to recover missing links.</w:t>
+      </w:r>
+    </w:p>
+    <w:p>
+      <w:pPr>
+        <w:spacing w:before="100"/>
+      </w:pPr>
+      <w:r>
+        <w:t xml:space="preserve">Taken together, the figure highlights that WLNM is </w:t>
+      </w:r>
+      <w:r>
+        <w:rPr>
+          <w:b/>
+          <w:bCs/>
+        </w:rPr>
+        <w:t>robust across a wide range of training set compositions</w:t>
+      </w:r>
+      <w:r>
+        <w:t xml:space="preserve">, but also that optimal recall and overall stability emerge when the training data contains a </w:t>
+      </w:r>
+      <w:r>
+        <w:rPr>
+          <w:b/>
+          <w:bCs/>
+        </w:rPr>
+        <w:t>balanced mixture of statistically supported (backbone) and non-backbone edges</w:t>
+      </w:r>
+      <w:r>
+        <w:t xml:space="preserve">. The 3D representation emphasizes these interaction effects, illustrating how both </w:t>
+      </w:r>
+      <w:proofErr w:type="spellStart"/>
+      <w:r>
+        <w:t>TrainRatio</w:t>
+      </w:r>
+      <w:proofErr w:type="spellEnd"/>
+      <w:r>
+        <w:t xml:space="preserve"> and </w:t>
+      </w:r>
+      <w:proofErr w:type="spellStart"/>
+      <w:r>
+        <w:t>BackboneRatio</w:t>
+      </w:r>
+      <w:proofErr w:type="spellEnd"/>
+      <w:r>
+        <w:t xml:space="preserve"> jointly shape predictive performance.</w:t>
+      </w:r>
+    </w:p>
+    <w:p>
+      <w:pPr>
+        <w:spacing w:beforeAutospacing="0" w:after="160" w:afterAutospacing="0" w:line="278" w:lineRule="auto"/>
+        <w:jc w:val="left"/>
+        <w:rPr>
+          <w:lang w:val="en-GB"/>
+        </w:rPr>
+      </w:pPr>
+      <w:r>
+        <w:rPr>
+          <w:lang w:val="en-GB"/>
+        </w:rPr>
+        <w:br w:type="page"/>
+      </w:r>
+    </w:p>
+    <w:p>
+      <w:pPr>
+        <w:spacing w:beforeAutospacing="0" w:after="160" w:afterAutospacing="0" w:line="278" w:lineRule="auto"/>
+        <w:jc w:val="left"/>
+        <w:rPr>
+          <w:lang w:val="en-GB"/>
+        </w:rPr>
+      </w:pPr>
+      <w:r>
+        <w:rPr>
+          <w:lang w:val="en-GB"/>
+        </w:rPr>
+        <w:lastRenderedPageBreak/>
+        <w:drawing>
+          <wp:inline distT="0" distB="0" distL="0" distR="0" wp14:anchorId="448A80F8" wp14:editId="1518E7F6">
+            <wp:extent cx="3651825" cy="2833816"/>
+            <wp:effectExtent l="0" t="0" r="6350" b="0"/>
+            <wp:docPr id="469738207" name="Picture 1" descr="A diagram of a network&#10;&#10;AI-generated content may be incorrect."/>
+            <wp:cNvGraphicFramePr>
+              <a:graphicFrameLocks xmlns:a="http://schemas.openxmlformats.org/drawingml/2006/main" noChangeAspect="1"/>
+            </wp:cNvGraphicFramePr>
+            <a:graphic xmlns:a="http://schemas.openxmlformats.org/drawingml/2006/main">
+              <a:graphicData uri="http://schemas.openxmlformats.org/drawingml/2006/picture">
+                <pic:pic xmlns:pic="http://schemas.openxmlformats.org/drawingml/2006/picture">
+                  <pic:nvPicPr>
+                    <pic:cNvPr id="469738207" name="Picture 1" descr="A diagram of a network&#10;&#10;AI-generated content may be incorrect."/>
+                    <pic:cNvPicPr/>
+                  </pic:nvPicPr>
+                  <pic:blipFill>
+                    <a:blip r:embed="rId30"/>
+                    <a:stretch>
+                      <a:fillRect/>
+                    </a:stretch>
+                  </pic:blipFill>
+                  <pic:spPr>
+                    <a:xfrm>
+                      <a:off x="0" y="0"/>
+                      <a:ext cx="3658344" cy="2838875"/>
+                    </a:xfrm>
+                    <a:prstGeom prst="rect">
+                      <a:avLst/>
+                    </a:prstGeom>
+                  </pic:spPr>
+                </pic:pic>
+              </a:graphicData>
+            </a:graphic>
+          </wp:inline>
+        </w:drawing>
+      </w:r>
+      <w:r>
+        <w:rPr>
+          <w:noProof/>
+          <w14:ligatures w14:val="standardContextual"/>
+        </w:rPr>
+        <w:t xml:space="preserve"> </w:t>
+      </w:r>
+      <w:r>
+        <w:rPr>
+          <w:lang w:val="en-GB"/>
+        </w:rPr>
+        <w:drawing>
+          <wp:inline distT="0" distB="0" distL="0" distR="0" wp14:anchorId="16E7A9B4" wp14:editId="5B797D11">
+            <wp:extent cx="4520765" cy="2594919"/>
+            <wp:effectExtent l="0" t="0" r="635" b="0"/>
+            <wp:docPr id="816541970" name="Picture 1" descr="A diagram of a network&#10;&#10;AI-generated content may be incorrect."/>
+            <wp:cNvGraphicFramePr>
+              <a:graphicFrameLocks xmlns:a="http://schemas.openxmlformats.org/drawingml/2006/main" noChangeAspect="1"/>
+            </wp:cNvGraphicFramePr>
+            <a:graphic xmlns:a="http://schemas.openxmlformats.org/drawingml/2006/main">
+              <a:graphicData uri="http://schemas.openxmlformats.org/drawingml/2006/picture">
+                <pic:pic xmlns:pic="http://schemas.openxmlformats.org/drawingml/2006/picture">
+                  <pic:nvPicPr>
+                    <pic:cNvPr id="816541970" name="Picture 1" descr="A diagram of a network&#10;&#10;AI-generated content may be incorrect."/>
+                    <pic:cNvPicPr/>
+                  </pic:nvPicPr>
+                  <pic:blipFill>
+                    <a:blip r:embed="rId31"/>
+                    <a:stretch>
+                      <a:fillRect/>
+                    </a:stretch>
+                  </pic:blipFill>
+                  <pic:spPr>
+                    <a:xfrm>
+                      <a:off x="0" y="0"/>
+                      <a:ext cx="4526407" cy="2598157"/>
+                    </a:xfrm>
+                    <a:prstGeom prst="rect">
+                      <a:avLst/>
+                    </a:prstGeom>
+                  </pic:spPr>
+                </pic:pic>
+              </a:graphicData>
+            </a:graphic>
+          </wp:inline>
+        </w:drawing>
+      </w:r>
+    </w:p>
+    <w:p>
+      <w:pPr>
+        <w:pStyle w:val="NormalWeb"/>
+      </w:pPr>
+      <w:r>
+        <w:rPr>
+          <w:rStyle w:val="Strong"/>
+        </w:rPr>
+        <w:t xml:space="preserve">Figure </w:t>
+      </w:r>
+      <w:r>
+        <w:rPr>
+          <w:rStyle w:val="Strong"/>
+        </w:rPr>
+        <w:t>21</w:t>
+      </w:r>
+      <w:r>
+        <w:rPr>
+          <w:rStyle w:val="Strong"/>
+        </w:rPr>
+        <w:t>.</w:t>
+      </w:r>
+      <w:r>
+        <w:rPr>
+          <w:rStyle w:val="Strong"/>
+        </w:rPr>
+        <w:t xml:space="preserve"> </w:t>
+      </w:r>
+      <w:r>
+        <w:t xml:space="preserve">These two panels illustrate how the statistically supported backbone of a food web highlights key trophic structures within the larger network. Nodes represent species and </w:t>
+      </w:r>
+      <w:proofErr w:type="gramStart"/>
+      <w:r>
+        <w:t>directed</w:t>
+      </w:r>
+      <w:proofErr w:type="gramEnd"/>
+      <w:r>
+        <w:t xml:space="preserve"> arrows represent feeding links. Backbone links are drawn as thick red arrows, while the remaining interactions appear as faint grey edges in the background. Node size reflects relative body mass (larger circles for heavier species), and node color distinguishes trophic roles: green for resources, blue for species that are both consumers and resources, and purple for consumers.</w:t>
+      </w:r>
+    </w:p>
+    <w:p>
+      <w:pPr>
+        <w:spacing w:before="100"/>
+      </w:pPr>
+      <w:r>
+        <w:t>In the left panel, backbone links concentrate around a central blue species that both preys on and is preyed upon by several neighbors, forming a tightly knit core motif embedded within a more diffuse set of weaker connections. In the right panel, a purple consumer sits at the center of a star-like pattern of red arrows from multiple green resources, capturing a strong hub-like feeding structure, while the rest of the web appears as a lighter scaffold to the side. Together, these examples show how the backbone isolates high-support interactions and reveals dominant consumers and key intermediate species that organize energy flow in the network.</w:t>
+      </w:r>
+    </w:p>
+    <w:p>
+      <w:pPr>
+        <w:spacing w:beforeAutospacing="0" w:after="160" w:afterAutospacing="0" w:line="278" w:lineRule="auto"/>
+        <w:jc w:val="left"/>
+        <w:rPr>
+          <w:lang w:val="en-GB"/>
+        </w:rPr>
+      </w:pPr>
+      <w:r>
+        <w:rPr>
+          <w:lang w:val="en-GB"/>
+        </w:rPr>
+        <w:br w:type="page"/>
+      </w:r>
+    </w:p>
+    <w:p>
+      <w:pPr>
+        <w:spacing w:beforeAutospacing="0" w:after="160" w:afterAutospacing="0" w:line="278" w:lineRule="auto"/>
+        <w:jc w:val="left"/>
+        <w:rPr>
+          <w:lang w:val="en-GB"/>
+        </w:rPr>
+      </w:pPr>
+      <w:r>
+        <w:rPr>
+          <w:lang w:val="en-GB"/>
+        </w:rPr>
+        <w:lastRenderedPageBreak/>
+        <w:drawing>
+          <wp:inline distT="0" distB="0" distL="0" distR="0" wp14:anchorId="5D1D7DE6" wp14:editId="0A1CEA1F">
+            <wp:extent cx="8229600" cy="2473325"/>
+            <wp:effectExtent l="0" t="0" r="0" b="3175"/>
+            <wp:docPr id="352485784" name="Picture 1" descr="A close-up of a graph&#10;&#10;AI-generated content may be incorrect."/>
+            <wp:cNvGraphicFramePr>
+              <a:graphicFrameLocks xmlns:a="http://schemas.openxmlformats.org/drawingml/2006/main" noChangeAspect="1"/>
+            </wp:cNvGraphicFramePr>
+            <a:graphic xmlns:a="http://schemas.openxmlformats.org/drawingml/2006/main">
+              <a:graphicData uri="http://schemas.openxmlformats.org/drawingml/2006/picture">
+                <pic:pic xmlns:pic="http://schemas.openxmlformats.org/drawingml/2006/picture">
+                  <pic:nvPicPr>
+                    <pic:cNvPr id="352485784" name="Picture 1" descr="A close-up of a graph&#10;&#10;AI-generated content may be incorrect."/>
+                    <pic:cNvPicPr/>
+                  </pic:nvPicPr>
+                  <pic:blipFill>
+                    <a:blip r:embed="rId32"/>
+                    <a:stretch>
+                      <a:fillRect/>
+                    </a:stretch>
+                  </pic:blipFill>
+                  <pic:spPr>
+                    <a:xfrm>
+                      <a:off x="0" y="0"/>
+                      <a:ext cx="8229600" cy="2473325"/>
+                    </a:xfrm>
+                    <a:prstGeom prst="rect">
+                      <a:avLst/>
+                    </a:prstGeom>
+                  </pic:spPr>
+                </pic:pic>
+              </a:graphicData>
+            </a:graphic>
+          </wp:inline>
+        </w:drawing>
+      </w:r>
+    </w:p>
+    <w:p>
+      <w:pPr>
+        <w:spacing w:beforeAutospacing="0" w:after="160" w:afterAutospacing="0" w:line="278" w:lineRule="auto"/>
+        <w:jc w:val="left"/>
+        <w:rPr>
+          <w:lang w:val="en-GB"/>
+        </w:rPr>
+      </w:pPr>
+      <w:r>
+        <w:rPr>
+          <w:lang w:val="en-GB"/>
+        </w:rPr>
+        <w:drawing>
+          <wp:inline distT="0" distB="0" distL="0" distR="0" wp14:anchorId="1F6B72A9" wp14:editId="439BCF9E">
+            <wp:extent cx="8229600" cy="2473325"/>
+            <wp:effectExtent l="0" t="0" r="0" b="3175"/>
+            <wp:docPr id="238611167" name="Picture 1" descr="A close-up of a graph&#10;&#10;AI-generated content may be incorrect."/>
+            <wp:cNvGraphicFramePr>
+              <a:graphicFrameLocks xmlns:a="http://schemas.openxmlformats.org/drawingml/2006/main" noChangeAspect="1"/>
+            </wp:cNvGraphicFramePr>
+            <a:graphic xmlns:a="http://schemas.openxmlformats.org/drawingml/2006/main">
+              <a:graphicData uri="http://schemas.openxmlformats.org/drawingml/2006/picture">
+                <pic:pic xmlns:pic="http://schemas.openxmlformats.org/drawingml/2006/picture">
+                  <pic:nvPicPr>
+                    <pic:cNvPr id="238611167" name="Picture 1" descr="A close-up of a graph&#10;&#10;AI-generated content may be incorrect."/>
+                    <pic:cNvPicPr/>
+                  </pic:nvPicPr>
+                  <pic:blipFill>
+                    <a:blip r:embed="rId33"/>
+                    <a:stretch>
+                      <a:fillRect/>
+                    </a:stretch>
+                  </pic:blipFill>
+                  <pic:spPr>
+                    <a:xfrm>
+                      <a:off x="0" y="0"/>
+                      <a:ext cx="8229600" cy="2473325"/>
+                    </a:xfrm>
+                    <a:prstGeom prst="rect">
+                      <a:avLst/>
+                    </a:prstGeom>
+                  </pic:spPr>
+                </pic:pic>
+              </a:graphicData>
+            </a:graphic>
+          </wp:inline>
+        </w:drawing>
+      </w:r>
+    </w:p>
+    <w:p>
+      <w:pPr>
+        <w:pStyle w:val="NormalWeb"/>
+      </w:pPr>
+      <w:r>
+        <w:rPr>
+          <w:rStyle w:val="Strong"/>
+        </w:rPr>
+        <w:t xml:space="preserve">Figure </w:t>
+      </w:r>
+      <w:r>
+        <w:rPr>
+          <w:rStyle w:val="Strong"/>
+        </w:rPr>
+        <w:t>22</w:t>
+      </w:r>
+      <w:r>
+        <w:rPr>
+          <w:rStyle w:val="Strong"/>
+        </w:rPr>
+        <w:t>.</w:t>
+      </w:r>
+      <w:r>
+        <w:rPr>
+          <w:rStyle w:val="Strong"/>
+        </w:rPr>
+        <w:t xml:space="preserve"> </w:t>
+      </w:r>
+      <w:r>
+        <w:t xml:space="preserve">These panels illustrate how the composition of training and testing links in a </w:t>
+      </w:r>
+      <w:proofErr w:type="gramStart"/>
+      <w:r>
+        <w:t>food web changes</w:t>
+      </w:r>
+      <w:proofErr w:type="gramEnd"/>
+      <w:r>
+        <w:t xml:space="preserve"> as the proportion of backbone versus non-backbone edges is modified, and how these structural adjustments affect predictive performance. Subplots </w:t>
+      </w:r>
+      <w:r>
+        <w:rPr>
+          <w:b/>
+          <w:bCs/>
+        </w:rPr>
+        <w:t>a–c</w:t>
+      </w:r>
+      <w:r>
+        <w:t xml:space="preserve"> </w:t>
+      </w:r>
+      <w:proofErr w:type="gramStart"/>
+      <w:r>
+        <w:t>show</w:t>
+      </w:r>
+      <w:proofErr w:type="gramEnd"/>
+      <w:r>
+        <w:t xml:space="preserve"> stacked bar charts for three training ratios (60%, 70%, 80%), separating links into four categories: train-backbone, train-non-backbone, test-</w:t>
+      </w:r>
+      <w:r>
+        <w:lastRenderedPageBreak/>
+        <w:t xml:space="preserve">backbone, and test-non-backbone. In the first row, the x-axis varies the </w:t>
+      </w:r>
+      <w:r>
+        <w:rPr>
+          <w:i/>
+          <w:iCs/>
+        </w:rPr>
+        <w:t>backbone ratio</w:t>
+      </w:r>
+      <w:r>
+        <w:t xml:space="preserve">, whereas the second row expresses the same configurations in terms of the complementary </w:t>
+      </w:r>
+      <w:r>
+        <w:rPr>
+          <w:i/>
+          <w:iCs/>
+        </w:rPr>
+        <w:t>non-backbone ratio</w:t>
+      </w:r>
+      <w:r>
+        <w:t>. These two representations highlight the same underlying splits but from opposite perspectives, making it easier to interpret how much of the network’s structural support (backbone edges) is included in the training set versus held out for evaluation.</w:t>
+      </w:r>
+    </w:p>
+    <w:p>
+      <w:pPr>
+        <w:spacing w:before="100"/>
+      </w:pPr>
+      <w:r>
+        <w:t>Across all training ratios, backbone edges consistently form a minority of total links, and increasing the backbone quota shifts more structurally important edges into the training portion. Conversely, increasing the non-backbone ratio allocates a larger share of weaker or statistically unsupported interactions to training. Despite these compositional shifts, total link counts remain stable, ensuring that model comparisons across ratios are structurally valid.</w:t>
+      </w:r>
+    </w:p>
+    <w:p>
+      <w:pPr>
+        <w:spacing w:before="100"/>
+      </w:pPr>
+      <w:r>
+        <w:t xml:space="preserve">Panel </w:t>
+      </w:r>
+      <w:r>
+        <w:rPr>
+          <w:b/>
+          <w:bCs/>
+        </w:rPr>
+        <w:t>d</w:t>
+      </w:r>
+      <w:r>
+        <w:t xml:space="preserve"> presents the resulting AUC scores in a 3D </w:t>
+      </w:r>
+      <w:proofErr w:type="spellStart"/>
+      <w:r>
+        <w:t>barplot</w:t>
+      </w:r>
+      <w:proofErr w:type="spellEnd"/>
+      <w:r>
+        <w:t>. Performance remains high across most configurations, but there are small, consistent variations associated with how strongly the training set is enriched or depleted in backbone edges. Models trained with more backbone information tend to achieve slightly higher AUC, while extreme imbalance (e.g., very high non-backbone ratios) produces mild performance drops. These results indicate that while the WLNM predictor is robust to substantial variation in link composition, its accuracy still benefits from preserving a representative fraction of statistically reliable backbone interactions during training.</w:t>
+      </w:r>
+    </w:p>
+    <w:p>
+      <w:pPr>
+        <w:spacing w:before="100"/>
+      </w:pPr>
+      <w:r>
+        <w:t>Overall, the figure demonstrates how backbone-aware train/test splits influence the structural composition of the data and modestly affect prediction quality, providing an interpretable foundation for evaluating robustness across different backbone regimes.</w:t>
+      </w:r>
+    </w:p>
+    <w:p>
+      <w:pPr>
+        <w:spacing w:beforeAutospacing="0" w:after="160" w:afterAutospacing="0" w:line="278" w:lineRule="auto"/>
+        <w:jc w:val="left"/>
+        <w:rPr>
+          <w:lang w:val="en-GB"/>
+        </w:rPr>
+      </w:pPr>
+      <w:r>
+        <w:rPr>
+          <w:lang w:val="en-GB"/>
+        </w:rPr>
+        <w:br w:type="page"/>
+      </w:r>
+    </w:p>
+    <w:p>
+      <w:pPr>
+        <w:spacing w:beforeAutospacing="0" w:after="160" w:afterAutospacing="0" w:line="278" w:lineRule="auto"/>
+        <w:jc w:val="left"/>
+        <w:rPr>
+          <w:lang w:val="en-GB"/>
+        </w:rPr>
+      </w:pPr>
+      <w:r>
+        <w:rPr>
+          <w:lang w:val="en-GB"/>
+        </w:rPr>
+        <w:lastRenderedPageBreak/>
+        <w:drawing>
+          <wp:inline distT="0" distB="0" distL="0" distR="0" wp14:anchorId="21C41625" wp14:editId="3BC7ACAB">
+            <wp:extent cx="7426625" cy="4934465"/>
+            <wp:effectExtent l="0" t="0" r="3175" b="6350"/>
+            <wp:docPr id="1031995943" name="Picture 1" descr="A graph with red and green dots&#10;&#10;AI-generated content may be incorrect."/>
+            <wp:cNvGraphicFramePr>
+              <a:graphicFrameLocks xmlns:a="http://schemas.openxmlformats.org/drawingml/2006/main" noChangeAspect="1"/>
+            </wp:cNvGraphicFramePr>
+            <a:graphic xmlns:a="http://schemas.openxmlformats.org/drawingml/2006/main">
+              <a:graphicData uri="http://schemas.openxmlformats.org/drawingml/2006/picture">
+                <pic:pic xmlns:pic="http://schemas.openxmlformats.org/drawingml/2006/picture">
+                  <pic:nvPicPr>
+                    <pic:cNvPr id="1031995943" name="Picture 1" descr="A graph with red and green dots&#10;&#10;AI-generated content may be incorrect."/>
+                    <pic:cNvPicPr/>
+                  </pic:nvPicPr>
+                  <pic:blipFill>
+                    <a:blip r:embed="rId34"/>
+                    <a:stretch>
+                      <a:fillRect/>
+                    </a:stretch>
+                  </pic:blipFill>
+                  <pic:spPr>
+                    <a:xfrm>
+                      <a:off x="0" y="0"/>
+                      <a:ext cx="7439752" cy="4943187"/>
+                    </a:xfrm>
+                    <a:prstGeom prst="rect">
+                      <a:avLst/>
+                    </a:prstGeom>
+                  </pic:spPr>
+                </pic:pic>
+              </a:graphicData>
+            </a:graphic>
+          </wp:inline>
+        </w:drawing>
+      </w:r>
+    </w:p>
+    <w:p>
+      <w:pPr>
+        <w:pStyle w:val="NormalWeb"/>
+      </w:pPr>
+      <w:r>
+        <w:rPr>
+          <w:rStyle w:val="Strong"/>
+        </w:rPr>
+        <w:t xml:space="preserve">Figure </w:t>
+      </w:r>
+      <w:r>
+        <w:rPr>
+          <w:rStyle w:val="Strong"/>
+        </w:rPr>
+        <w:t>23</w:t>
+      </w:r>
+      <w:r>
+        <w:rPr>
+          <w:rStyle w:val="Strong"/>
+        </w:rPr>
+        <w:t>.</w:t>
+      </w:r>
+      <w:r>
+        <w:rPr>
+          <w:rStyle w:val="Strong"/>
+        </w:rPr>
+        <w:t xml:space="preserve"> </w:t>
+      </w:r>
+      <w:r>
+        <w:t>This figure compares the predictive performance of two WLNM configurations—</w:t>
+      </w:r>
+      <w:r>
+        <w:rPr>
+          <w:b/>
+          <w:bCs/>
+        </w:rPr>
+        <w:t>Backbone</w:t>
+      </w:r>
+      <w:r>
+        <w:t xml:space="preserve"> and </w:t>
+      </w:r>
+      <w:r>
+        <w:rPr>
+          <w:b/>
+          <w:bCs/>
+        </w:rPr>
+        <w:t>Flagship</w:t>
+      </w:r>
+      <w:r>
+        <w:t xml:space="preserve">—across all food webs with more than 40 nodes. Food webs are ordered along the x-axis by increasing network size, and for each web the plot shows the </w:t>
+      </w:r>
+      <w:r>
+        <w:rPr>
+          <w:b/>
+          <w:bCs/>
+        </w:rPr>
+        <w:t>average AUC</w:t>
+      </w:r>
+      <w:r>
+        <w:t xml:space="preserve"> obtained from multiple runs (</w:t>
+      </w:r>
+      <w:proofErr w:type="spellStart"/>
+      <w:r>
+        <w:t>TrainRatio</w:t>
+      </w:r>
+      <w:proofErr w:type="spellEnd"/>
+      <w:r>
+        <w:t xml:space="preserve"> = 80%). Individual run outcomes appear as scattered points (green for Backbone, red for Flagship), while smoothed trend lines highlight the general performance trajectory of each method.</w:t>
+      </w:r>
+    </w:p>
+    <w:p>
+      <w:pPr>
+        <w:spacing w:before="100"/>
+      </w:pPr>
+      <w:r>
+        <w:lastRenderedPageBreak/>
+        <w:t>A clear pattern emerges: both models improve steadily as network size increases, reflecting the fact that larger webs provide richer structural information for subgraph-based learning. The Flagship method shows a slight advantage in the smaller and medium-sized webs, where its less constrained sampling strategy appears to capture additional informative patterns. However, as food webs become larger and more complex, the two methods converge, and their AUC curves track each other closely.</w:t>
+      </w:r>
+    </w:p>
+    <w:p>
+      <w:pPr>
+        <w:spacing w:before="100"/>
+      </w:pPr>
+      <w:r>
+        <w:t>The dispersion of points around each trend also reveals that variability decreases with network size—smaller webs exhibit more run-to-run fluctuation, while larger webs yield more stable predictions. Overall, the figure demonstrates that both approaches scale well with network complexity, that differences are modest relative to the underlying structural signal, and that performance stabilizes as more trophic information becomes available.</w:t>
+      </w:r>
+    </w:p>
+    <w:p>
+      <w:pPr>
+        <w:spacing w:beforeAutospacing="0" w:after="160" w:afterAutospacing="0" w:line="278" w:lineRule="auto"/>
+        <w:jc w:val="left"/>
+        <w:rPr>
+          <w:lang w:val="en-GB"/>
+        </w:rPr>
+      </w:pPr>
       <w:r>
         <w:rPr>
           <w:lang w:val="en-GB"/>
@@ -5981,8 +7457,8 @@
       </w:sdtContent>
     </w:sdt>
     <w:sectPr>
-      <w:footerReference w:type="even" r:id="rId23"/>
-      <w:footerReference w:type="default" r:id="rId24"/>
+      <w:footerReference w:type="even" r:id="rId35"/>
+      <w:footerReference w:type="default" r:id="rId36"/>
       <w:pgSz w:w="15840" w:h="12240" w:orient="landscape"/>
       <w:pgMar w:top="1440" w:right="1440" w:bottom="1440" w:left="1440" w:header="720" w:footer="720" w:gutter="0"/>
       <w:lnNumType w:countBy="1" w:restart="newSection"/>
@@ -10592,6 +12068,7 @@
   <w:style w:type="character" w:default="1" w:styleId="DefaultParagraphFont">
     <w:name w:val="Default Paragraph Font"/>
     <w:uiPriority w:val="1"/>
+    <w:semiHidden/>
     <w:unhideWhenUsed/>
   </w:style>
   <w:style w:type="table" w:default="1" w:styleId="TableNormal">
@@ -11156,7 +12633,7 @@
     <w:charset w:val="00"/>
     <w:family w:val="modern"/>
     <w:pitch w:val="fixed"/>
-    <w:sig w:usb0="E0002AFF" w:usb1="C0007843" w:usb2="00000009" w:usb3="00000000" w:csb0="000001FF" w:csb1="00000000"/>
+    <w:sig w:usb0="E0002EFF" w:usb1="C0007843" w:usb2="00000009" w:usb3="00000000" w:csb0="000001FF" w:csb1="00000000"/>
   </w:font>
   <w:font w:name="Wingdings">
     <w:panose1 w:val="05000000000000000000"/>
@@ -11202,11 +12679,13 @@
     <w:rsid w:val="002356C4"/>
     <w:rsid w:val="002554D8"/>
     <w:rsid w:val="002A05A9"/>
+    <w:rsid w:val="002A13CE"/>
     <w:rsid w:val="005E48B7"/>
     <w:rsid w:val="00702A06"/>
     <w:rsid w:val="00783B27"/>
     <w:rsid w:val="007D0F1C"/>
     <w:rsid w:val="00A212CF"/>
+    <w:rsid w:val="00B22E41"/>
     <w:rsid w:val="00B96783"/>
     <w:rsid w:val="00C63B02"/>
     <w:rsid w:val="00EA32DF"/>

</xml_diff>